<commit_message>
docs: add re-run on a second (Windows) machine to the midterm report and deck
- results from the Windows machine (race and sequential reports) match the Mac run 8/8
- midterm report: new subsection with the comparison, caveats and discarded first runs
- midterm deck: new slide 11 (13 slides), progress and plan updated

Co-Authored-By: Claude Sonnet 5.5 <noreply@anthropic.com>
</commit_message>
<xml_diff>
--- a/docs/BAO_CAO_GIUA_KY_R05-K15.docx
+++ b/docs/BAO_CAO_GIUA_KY_R05-K15.docx
@@ -5224,9 +5224,9 @@
         </w:tblCellMar>
       </w:tblPr>
       <w:tblGrid>
-        <w:gridCol w:w="2767"/>
-        <w:gridCol w:w="4813"/>
-        <w:gridCol w:w="1446"/>
+        <w:gridCol w:w="2332"/>
+        <w:gridCol w:w="4056"/>
+        <w:gridCol w:w="2638"/>
       </w:tblGrid>
       <w:tr>
         <w:trPr>
@@ -5234,7 +5234,7 @@
         </w:trPr>
         <w:tc>
           <w:tcPr>
-            <w:tcW w:type="dxa" w:w="2767"/>
+            <w:tcW w:type="dxa" w:w="2332"/>
             <w:tcBorders>
               <w:top w:val="single" w:color="BFBFBF" w:sz="4"/>
               <w:left w:val="single" w:color="BFBFBF" w:sz="4"/>
@@ -5263,7 +5263,7 @@
         </w:tc>
         <w:tc>
           <w:tcPr>
-            <w:tcW w:type="dxa" w:w="4813"/>
+            <w:tcW w:type="dxa" w:w="4056"/>
             <w:tcBorders>
               <w:top w:val="single" w:color="BFBFBF" w:sz="4"/>
               <w:left w:val="single" w:color="BFBFBF" w:sz="4"/>
@@ -5292,7 +5292,7 @@
         </w:tc>
         <w:tc>
           <w:tcPr>
-            <w:tcW w:type="dxa" w:w="1446"/>
+            <w:tcW w:type="dxa" w:w="2638"/>
             <w:tcBorders>
               <w:top w:val="single" w:color="BFBFBF" w:sz="4"/>
               <w:left w:val="single" w:color="BFBFBF" w:sz="4"/>
@@ -5326,7 +5326,7 @@
         </w:trPr>
         <w:tc>
           <w:tcPr>
-            <w:tcW w:type="dxa" w:w="2767"/>
+            <w:tcW w:type="dxa" w:w="2332"/>
             <w:tcBorders>
               <w:top w:val="single" w:color="BFBFBF" w:sz="4"/>
               <w:left w:val="single" w:color="BFBFBF" w:sz="4"/>
@@ -5352,7 +5352,7 @@
         </w:tc>
         <w:tc>
           <w:tcPr>
-            <w:tcW w:type="dxa" w:w="4813"/>
+            <w:tcW w:type="dxa" w:w="4056"/>
             <w:tcBorders>
               <w:top w:val="single" w:color="BFBFBF" w:sz="4"/>
               <w:left w:val="single" w:color="BFBFBF" w:sz="4"/>
@@ -5378,7 +5378,7 @@
         </w:tc>
         <w:tc>
           <w:tcPr>
-            <w:tcW w:type="dxa" w:w="1446"/>
+            <w:tcW w:type="dxa" w:w="2638"/>
             <w:tcBorders>
               <w:top w:val="single" w:color="BFBFBF" w:sz="4"/>
               <w:left w:val="single" w:color="BFBFBF" w:sz="4"/>
@@ -5409,7 +5409,7 @@
         </w:trPr>
         <w:tc>
           <w:tcPr>
-            <w:tcW w:type="dxa" w:w="2767"/>
+            <w:tcW w:type="dxa" w:w="2332"/>
             <w:tcBorders>
               <w:top w:val="single" w:color="BFBFBF" w:sz="4"/>
               <w:left w:val="single" w:color="BFBFBF" w:sz="4"/>
@@ -5435,7 +5435,7 @@
         </w:tc>
         <w:tc>
           <w:tcPr>
-            <w:tcW w:type="dxa" w:w="4813"/>
+            <w:tcW w:type="dxa" w:w="4056"/>
             <w:tcBorders>
               <w:top w:val="single" w:color="BFBFBF" w:sz="4"/>
               <w:left w:val="single" w:color="BFBFBF" w:sz="4"/>
@@ -5461,7 +5461,7 @@
         </w:tc>
         <w:tc>
           <w:tcPr>
-            <w:tcW w:type="dxa" w:w="1446"/>
+            <w:tcW w:type="dxa" w:w="2638"/>
             <w:tcBorders>
               <w:top w:val="single" w:color="BFBFBF" w:sz="4"/>
               <w:left w:val="single" w:color="BFBFBF" w:sz="4"/>
@@ -5492,79 +5492,79 @@
         </w:trPr>
         <w:tc>
           <w:tcPr>
-            <w:tcW w:type="dxa" w:w="2767"/>
-            <w:tcBorders>
-              <w:top w:val="single" w:color="BFBFBF" w:sz="4"/>
-              <w:left w:val="single" w:color="BFBFBF" w:sz="4"/>
-              <w:bottom w:val="single" w:color="BFBFBF" w:sz="4"/>
-              <w:right w:val="single" w:color="BFBFBF" w:sz="4"/>
-            </w:tcBorders>
-            <w:tcMar>
-              <w:top w:type="dxa" w:w="60"/>
-              <w:left w:type="dxa" w:w="100"/>
-              <w:bottom w:type="dxa" w:w="60"/>
-              <w:right w:type="dxa" w:w="100"/>
-            </w:tcMar>
-          </w:tcPr>
-          <w:p>
-            <w:r>
-              <w:rPr>
-                <w:sz w:val="20"/>
-                <w:szCs w:val="20"/>
-              </w:rPr>
-              <w:t xml:space="preserve">Sprint 2 và 3 (còn lại)</w:t>
-            </w:r>
-          </w:p>
-        </w:tc>
-        <w:tc>
-          <w:tcPr>
-            <w:tcW w:type="dxa" w:w="4813"/>
-            <w:tcBorders>
-              <w:top w:val="single" w:color="BFBFBF" w:sz="4"/>
-              <w:left w:val="single" w:color="BFBFBF" w:sz="4"/>
-              <w:bottom w:val="single" w:color="BFBFBF" w:sz="4"/>
-              <w:right w:val="single" w:color="BFBFBF" w:sz="4"/>
-            </w:tcBorders>
-            <w:tcMar>
-              <w:top w:type="dxa" w:w="60"/>
-              <w:left w:type="dxa" w:w="100"/>
-              <w:bottom w:type="dxa" w:w="60"/>
-              <w:right w:type="dxa" w:w="100"/>
-            </w:tcMar>
-          </w:tcPr>
-          <w:p>
-            <w:r>
-              <w:rPr>
-                <w:sz w:val="20"/>
-                <w:szCs w:val="20"/>
-              </w:rPr>
-              <w:t xml:space="preserve">Test qua giao diện bằng Playwright; chạy lại trên máy của thành viên khác</w:t>
-            </w:r>
-          </w:p>
-        </w:tc>
-        <w:tc>
-          <w:tcPr>
-            <w:tcW w:type="dxa" w:w="1446"/>
-            <w:tcBorders>
-              <w:top w:val="single" w:color="BFBFBF" w:sz="4"/>
-              <w:left w:val="single" w:color="BFBFBF" w:sz="4"/>
-              <w:bottom w:val="single" w:color="BFBFBF" w:sz="4"/>
-              <w:right w:val="single" w:color="BFBFBF" w:sz="4"/>
-            </w:tcBorders>
-            <w:tcMar>
-              <w:top w:type="dxa" w:w="60"/>
-              <w:left w:type="dxa" w:w="100"/>
-              <w:bottom w:type="dxa" w:w="60"/>
-              <w:right w:type="dxa" w:w="100"/>
-            </w:tcMar>
-          </w:tcPr>
-          <w:p>
-            <w:r>
-              <w:rPr>
-                <w:sz w:val="20"/>
-                <w:szCs w:val="20"/>
-              </w:rPr>
-              <w:t xml:space="preserve">Chưa làm</w:t>
+            <w:tcW w:type="dxa" w:w="2332"/>
+            <w:tcBorders>
+              <w:top w:val="single" w:color="BFBFBF" w:sz="4"/>
+              <w:left w:val="single" w:color="BFBFBF" w:sz="4"/>
+              <w:bottom w:val="single" w:color="BFBFBF" w:sz="4"/>
+              <w:right w:val="single" w:color="BFBFBF" w:sz="4"/>
+            </w:tcBorders>
+            <w:tcMar>
+              <w:top w:type="dxa" w:w="60"/>
+              <w:left w:type="dxa" w:w="100"/>
+              <w:bottom w:type="dxa" w:w="60"/>
+              <w:right w:type="dxa" w:w="100"/>
+            </w:tcMar>
+          </w:tcPr>
+          <w:p>
+            <w:r>
+              <w:rPr>
+                <w:sz w:val="20"/>
+                <w:szCs w:val="20"/>
+              </w:rPr>
+              <w:t xml:space="preserve">Sprint 2 và 3</w:t>
+            </w:r>
+          </w:p>
+        </w:tc>
+        <w:tc>
+          <w:tcPr>
+            <w:tcW w:type="dxa" w:w="4056"/>
+            <w:tcBorders>
+              <w:top w:val="single" w:color="BFBFBF" w:sz="4"/>
+              <w:left w:val="single" w:color="BFBFBF" w:sz="4"/>
+              <w:bottom w:val="single" w:color="BFBFBF" w:sz="4"/>
+              <w:right w:val="single" w:color="BFBFBF" w:sz="4"/>
+            </w:tcBorders>
+            <w:tcMar>
+              <w:top w:type="dxa" w:w="60"/>
+              <w:left w:type="dxa" w:w="100"/>
+              <w:bottom w:type="dxa" w:w="60"/>
+              <w:right w:type="dxa" w:w="100"/>
+            </w:tcMar>
+          </w:tcPr>
+          <w:p>
+            <w:r>
+              <w:rPr>
+                <w:sz w:val="20"/>
+                <w:szCs w:val="20"/>
+              </w:rPr>
+              <w:t xml:space="preserve">Chạy lại trên máy Windows của thành viên khác</w:t>
+            </w:r>
+          </w:p>
+        </w:tc>
+        <w:tc>
+          <w:tcPr>
+            <w:tcW w:type="dxa" w:w="2638"/>
+            <w:tcBorders>
+              <w:top w:val="single" w:color="BFBFBF" w:sz="4"/>
+              <w:left w:val="single" w:color="BFBFBF" w:sz="4"/>
+              <w:bottom w:val="single" w:color="BFBFBF" w:sz="4"/>
+              <w:right w:val="single" w:color="BFBFBF" w:sz="4"/>
+            </w:tcBorders>
+            <w:tcMar>
+              <w:top w:type="dxa" w:w="60"/>
+              <w:left w:type="dxa" w:w="100"/>
+              <w:bottom w:type="dxa" w:w="60"/>
+              <w:right w:type="dxa" w:w="100"/>
+            </w:tcMar>
+          </w:tcPr>
+          <w:p>
+            <w:r>
+              <w:rPr>
+                <w:sz w:val="20"/>
+                <w:szCs w:val="20"/>
+              </w:rPr>
+              <w:t xml:space="preserve">Đã chạy xong, kết quả khớp</w:t>
             </w:r>
           </w:p>
         </w:tc>
@@ -5575,79 +5575,79 @@
         </w:trPr>
         <w:tc>
           <w:tcPr>
-            <w:tcW w:type="dxa" w:w="2767"/>
-            <w:tcBorders>
-              <w:top w:val="single" w:color="BFBFBF" w:sz="4"/>
-              <w:left w:val="single" w:color="BFBFBF" w:sz="4"/>
-              <w:bottom w:val="single" w:color="BFBFBF" w:sz="4"/>
-              <w:right w:val="single" w:color="BFBFBF" w:sz="4"/>
-            </w:tcBorders>
-            <w:tcMar>
-              <w:top w:type="dxa" w:w="60"/>
-              <w:left w:type="dxa" w:w="100"/>
-              <w:bottom w:type="dxa" w:w="60"/>
-              <w:right w:type="dxa" w:w="100"/>
-            </w:tcMar>
-          </w:tcPr>
-          <w:p>
-            <w:r>
-              <w:rPr>
-                <w:sz w:val="20"/>
-                <w:szCs w:val="20"/>
-              </w:rPr>
-              <w:t xml:space="preserve">Sprint 4</w:t>
-            </w:r>
-          </w:p>
-        </w:tc>
-        <w:tc>
-          <w:tcPr>
-            <w:tcW w:type="dxa" w:w="4813"/>
-            <w:tcBorders>
-              <w:top w:val="single" w:color="BFBFBF" w:sz="4"/>
-              <w:left w:val="single" w:color="BFBFBF" w:sz="4"/>
-              <w:bottom w:val="single" w:color="BFBFBF" w:sz="4"/>
-              <w:right w:val="single" w:color="BFBFBF" w:sz="4"/>
-            </w:tcBorders>
-            <w:tcMar>
-              <w:top w:type="dxa" w:w="60"/>
-              <w:left w:type="dxa" w:w="100"/>
-              <w:bottom w:type="dxa" w:w="60"/>
-              <w:right w:type="dxa" w:w="100"/>
-            </w:tcMar>
-          </w:tcPr>
-          <w:p>
-            <w:r>
-              <w:rPr>
-                <w:sz w:val="20"/>
-                <w:szCs w:val="20"/>
-              </w:rPr>
-              <w:t xml:space="preserve">Rà soát nguyên nhân gốc, đề xuất sửa, hoàn thiện báo cáo</w:t>
-            </w:r>
-          </w:p>
-        </w:tc>
-        <w:tc>
-          <w:tcPr>
-            <w:tcW w:type="dxa" w:w="1446"/>
-            <w:tcBorders>
-              <w:top w:val="single" w:color="BFBFBF" w:sz="4"/>
-              <w:left w:val="single" w:color="BFBFBF" w:sz="4"/>
-              <w:bottom w:val="single" w:color="BFBFBF" w:sz="4"/>
-              <w:right w:val="single" w:color="BFBFBF" w:sz="4"/>
-            </w:tcBorders>
-            <w:tcMar>
-              <w:top w:type="dxa" w:w="60"/>
-              <w:left w:type="dxa" w:w="100"/>
-              <w:bottom w:type="dxa" w:w="60"/>
-              <w:right w:type="dxa" w:w="100"/>
-            </w:tcMar>
-          </w:tcPr>
-          <w:p>
-            <w:r>
-              <w:rPr>
-                <w:sz w:val="20"/>
-                <w:szCs w:val="20"/>
-              </w:rPr>
-              <w:t xml:space="preserve">Đang làm</w:t>
+            <w:tcW w:type="dxa" w:w="2332"/>
+            <w:tcBorders>
+              <w:top w:val="single" w:color="BFBFBF" w:sz="4"/>
+              <w:left w:val="single" w:color="BFBFBF" w:sz="4"/>
+              <w:bottom w:val="single" w:color="BFBFBF" w:sz="4"/>
+              <w:right w:val="single" w:color="BFBFBF" w:sz="4"/>
+            </w:tcBorders>
+            <w:tcMar>
+              <w:top w:type="dxa" w:w="60"/>
+              <w:left w:type="dxa" w:w="100"/>
+              <w:bottom w:type="dxa" w:w="60"/>
+              <w:right w:type="dxa" w:w="100"/>
+            </w:tcMar>
+          </w:tcPr>
+          <w:p>
+            <w:r>
+              <w:rPr>
+                <w:sz w:val="20"/>
+                <w:szCs w:val="20"/>
+              </w:rPr>
+              <w:t xml:space="preserve">Sprint 2 và 3 (còn lại)</w:t>
+            </w:r>
+          </w:p>
+        </w:tc>
+        <w:tc>
+          <w:tcPr>
+            <w:tcW w:type="dxa" w:w="4056"/>
+            <w:tcBorders>
+              <w:top w:val="single" w:color="BFBFBF" w:sz="4"/>
+              <w:left w:val="single" w:color="BFBFBF" w:sz="4"/>
+              <w:bottom w:val="single" w:color="BFBFBF" w:sz="4"/>
+              <w:right w:val="single" w:color="BFBFBF" w:sz="4"/>
+            </w:tcBorders>
+            <w:tcMar>
+              <w:top w:type="dxa" w:w="60"/>
+              <w:left w:type="dxa" w:w="100"/>
+              <w:bottom w:type="dxa" w:w="60"/>
+              <w:right w:type="dxa" w:w="100"/>
+            </w:tcMar>
+          </w:tcPr>
+          <w:p>
+            <w:r>
+              <w:rPr>
+                <w:sz w:val="20"/>
+                <w:szCs w:val="20"/>
+              </w:rPr>
+              <w:t xml:space="preserve">Test qua giao diện bằng Playwright</w:t>
+            </w:r>
+          </w:p>
+        </w:tc>
+        <w:tc>
+          <w:tcPr>
+            <w:tcW w:type="dxa" w:w="2638"/>
+            <w:tcBorders>
+              <w:top w:val="single" w:color="BFBFBF" w:sz="4"/>
+              <w:left w:val="single" w:color="BFBFBF" w:sz="4"/>
+              <w:bottom w:val="single" w:color="BFBFBF" w:sz="4"/>
+              <w:right w:val="single" w:color="BFBFBF" w:sz="4"/>
+            </w:tcBorders>
+            <w:tcMar>
+              <w:top w:type="dxa" w:w="60"/>
+              <w:left w:type="dxa" w:w="100"/>
+              <w:bottom w:type="dxa" w:w="60"/>
+              <w:right w:type="dxa" w:w="100"/>
+            </w:tcMar>
+          </w:tcPr>
+          <w:p>
+            <w:r>
+              <w:rPr>
+                <w:sz w:val="20"/>
+                <w:szCs w:val="20"/>
+              </w:rPr>
+              <w:t xml:space="preserve">Chưa làm</w:t>
             </w:r>
           </w:p>
         </w:tc>
@@ -5658,7 +5658,90 @@
         </w:trPr>
         <w:tc>
           <w:tcPr>
-            <w:tcW w:type="dxa" w:w="2767"/>
+            <w:tcW w:type="dxa" w:w="2332"/>
+            <w:tcBorders>
+              <w:top w:val="single" w:color="BFBFBF" w:sz="4"/>
+              <w:left w:val="single" w:color="BFBFBF" w:sz="4"/>
+              <w:bottom w:val="single" w:color="BFBFBF" w:sz="4"/>
+              <w:right w:val="single" w:color="BFBFBF" w:sz="4"/>
+            </w:tcBorders>
+            <w:tcMar>
+              <w:top w:type="dxa" w:w="60"/>
+              <w:left w:type="dxa" w:w="100"/>
+              <w:bottom w:type="dxa" w:w="60"/>
+              <w:right w:type="dxa" w:w="100"/>
+            </w:tcMar>
+          </w:tcPr>
+          <w:p>
+            <w:r>
+              <w:rPr>
+                <w:sz w:val="20"/>
+                <w:szCs w:val="20"/>
+              </w:rPr>
+              <w:t xml:space="preserve">Sprint 4</w:t>
+            </w:r>
+          </w:p>
+        </w:tc>
+        <w:tc>
+          <w:tcPr>
+            <w:tcW w:type="dxa" w:w="4056"/>
+            <w:tcBorders>
+              <w:top w:val="single" w:color="BFBFBF" w:sz="4"/>
+              <w:left w:val="single" w:color="BFBFBF" w:sz="4"/>
+              <w:bottom w:val="single" w:color="BFBFBF" w:sz="4"/>
+              <w:right w:val="single" w:color="BFBFBF" w:sz="4"/>
+            </w:tcBorders>
+            <w:tcMar>
+              <w:top w:type="dxa" w:w="60"/>
+              <w:left w:type="dxa" w:w="100"/>
+              <w:bottom w:type="dxa" w:w="60"/>
+              <w:right w:type="dxa" w:w="100"/>
+            </w:tcMar>
+          </w:tcPr>
+          <w:p>
+            <w:r>
+              <w:rPr>
+                <w:sz w:val="20"/>
+                <w:szCs w:val="20"/>
+              </w:rPr>
+              <w:t xml:space="preserve">Rà soát nguyên nhân gốc, đề xuất sửa, hoàn thiện báo cáo</w:t>
+            </w:r>
+          </w:p>
+        </w:tc>
+        <w:tc>
+          <w:tcPr>
+            <w:tcW w:type="dxa" w:w="2638"/>
+            <w:tcBorders>
+              <w:top w:val="single" w:color="BFBFBF" w:sz="4"/>
+              <w:left w:val="single" w:color="BFBFBF" w:sz="4"/>
+              <w:bottom w:val="single" w:color="BFBFBF" w:sz="4"/>
+              <w:right w:val="single" w:color="BFBFBF" w:sz="4"/>
+            </w:tcBorders>
+            <w:tcMar>
+              <w:top w:type="dxa" w:w="60"/>
+              <w:left w:type="dxa" w:w="100"/>
+              <w:bottom w:type="dxa" w:w="60"/>
+              <w:right w:type="dxa" w:w="100"/>
+            </w:tcMar>
+          </w:tcPr>
+          <w:p>
+            <w:r>
+              <w:rPr>
+                <w:sz w:val="20"/>
+                <w:szCs w:val="20"/>
+              </w:rPr>
+              <w:t xml:space="preserve">Đang làm</w:t>
+            </w:r>
+          </w:p>
+        </w:tc>
+      </w:tr>
+      <w:tr>
+        <w:trPr>
+          <w:tblHeader w:val="off"/>
+        </w:trPr>
+        <w:tc>
+          <w:tcPr>
+            <w:tcW w:type="dxa" w:w="2332"/>
             <w:tcBorders>
               <w:top w:val="single" w:color="BFBFBF" w:sz="4"/>
               <w:left w:val="single" w:color="BFBFBF" w:sz="4"/>
@@ -5684,7 +5767,7 @@
         </w:tc>
         <w:tc>
           <w:tcPr>
-            <w:tcW w:type="dxa" w:w="4813"/>
+            <w:tcW w:type="dxa" w:w="4056"/>
             <w:tcBorders>
               <w:top w:val="single" w:color="BFBFBF" w:sz="4"/>
               <w:left w:val="single" w:color="BFBFBF" w:sz="4"/>
@@ -5710,7 +5793,7 @@
         </w:tc>
         <w:tc>
           <w:tcPr>
-            <w:tcW w:type="dxa" w:w="1446"/>
+            <w:tcW w:type="dxa" w:w="2638"/>
             <w:tcBorders>
               <w:top w:val="single" w:color="BFBFBF" w:sz="4"/>
               <w:left w:val="single" w:color="BFBFBF" w:sz="4"/>
@@ -8065,6 +8148,1426 @@
     </w:p>
     <w:p>
       <w:pPr>
+        <w:pStyle w:val="Heading3"/>
+      </w:pPr>
+      <w:r>
+        <w:t xml:space="preserve">Chạy lại trên máy thứ hai (Windows)</w:t>
+      </w:r>
+    </w:p>
+    <w:p>
+      <w:pPr>
+        <w:spacing w:after="120" w:line="300"/>
+      </w:pPr>
+      <w:r>
+        <w:t xml:space="preserve">Một thành viên chạy lại toàn bộ bộ test trên máy Windows của mình, với cùng phiên bản mã (Cal.com v6.2.0, bộ test cùng commit) để kiểm tra kết quả có phụ thuộc vào máy hay không.</w:t>
+      </w:r>
+    </w:p>
+    <w:p>
+      <w:pPr>
+        <w:pStyle w:val="ListParagraph"/>
+        <w:numPr>
+          <w:ilvl w:val="0"/>
+          <w:numId w:val="3"/>
+        </w:numPr>
+        <w:spacing w:after="60"/>
+      </w:pPr>
+      <w:r>
+        <w:t xml:space="preserve">Người test: [điền tên thành viên]</w:t>
+      </w:r>
+    </w:p>
+    <w:p>
+      <w:pPr>
+        <w:pStyle w:val="ListParagraph"/>
+        <w:numPr>
+          <w:ilvl w:val="0"/>
+          <w:numId w:val="3"/>
+        </w:numPr>
+        <w:spacing w:after="60"/>
+      </w:pPr>
+      <w:r>
+        <w:t xml:space="preserve">Cấu hình máy: [điền CPU, RAM, hệ điều hành, phiên bản Node và k6]</w:t>
+      </w:r>
+    </w:p>
+    <w:p>
+      <w:pPr>
+        <w:pStyle w:val="ListParagraph"/>
+        <w:numPr>
+          <w:ilvl w:val="0"/>
+          <w:numId w:val="3"/>
+        </w:numPr>
+        <w:spacing w:after="60"/>
+      </w:pPr>
+      <w:r>
+        <w:t xml:space="preserve">Ngày chạy: 18/10/2026</w:t>
+      </w:r>
+    </w:p>
+    <w:p>
+      <w:pPr>
+        <w:pStyle w:val="ListParagraph"/>
+        <w:numPr>
+          <w:ilvl w:val="0"/>
+          <w:numId w:val="3"/>
+        </w:numPr>
+        <w:spacing w:after="60"/>
+      </w:pPr>
+      <w:r>
+        <w:t xml:space="preserve">Kết quả đồng thời: </w:t>
+      </w:r>
+      <w:r>
+        <w:t xml:space="preserve">race-tests/results/windows-race/REPORT.md</w:t>
+      </w:r>
+    </w:p>
+    <w:p>
+      <w:pPr>
+        <w:pStyle w:val="ListParagraph"/>
+        <w:numPr>
+          <w:ilvl w:val="0"/>
+          <w:numId w:val="3"/>
+        </w:numPr>
+        <w:spacing w:after="60"/>
+      </w:pPr>
+      <w:r>
+        <w:t xml:space="preserve">Kết quả tuần tự: </w:t>
+      </w:r>
+      <w:r>
+        <w:t xml:space="preserve">race-tests/results/windows-sequential/REPORT.md</w:t>
+      </w:r>
+    </w:p>
+    <w:tbl>
+      <w:tblPr>
+        <w:tblW w:type="dxa" w:w="9026"/>
+        <w:tblBorders>
+          <w:top w:val="single" w:color="auto" w:sz="4"/>
+          <w:left w:val="single" w:color="auto" w:sz="4"/>
+          <w:bottom w:val="single" w:color="auto" w:sz="4"/>
+          <w:right w:val="single" w:color="auto" w:sz="4"/>
+          <w:insideH w:val="single" w:color="auto" w:sz="4"/>
+          <w:insideV w:val="single" w:color="auto" w:sz="4"/>
+        </w:tblBorders>
+        <w:tblCellMar>
+          <w:top w:type="dxa" w:w="0"/>
+          <w:bottom w:type="dxa" w:w="0"/>
+        </w:tblCellMar>
+      </w:tblPr>
+      <w:tblGrid>
+        <w:gridCol w:w="1128"/>
+        <w:gridCol w:w="1974"/>
+        <w:gridCol w:w="2538"/>
+        <w:gridCol w:w="2256"/>
+        <w:gridCol w:w="1130"/>
+      </w:tblGrid>
+      <w:tr>
+        <w:trPr>
+          <w:tblHeader/>
+        </w:trPr>
+        <w:tc>
+          <w:tcPr>
+            <w:tcW w:type="dxa" w:w="1128"/>
+            <w:tcBorders>
+              <w:top w:val="single" w:color="BFBFBF" w:sz="4"/>
+              <w:left w:val="single" w:color="BFBFBF" w:sz="4"/>
+              <w:bottom w:val="single" w:color="BFBFBF" w:sz="4"/>
+              <w:right w:val="single" w:color="BFBFBF" w:sz="4"/>
+            </w:tcBorders>
+            <w:shd w:fill="DCE6F1" w:val="clear"/>
+            <w:tcMar>
+              <w:top w:type="dxa" w:w="60"/>
+              <w:left w:type="dxa" w:w="100"/>
+              <w:bottom w:type="dxa" w:w="60"/>
+              <w:right w:type="dxa" w:w="100"/>
+            </w:tcMar>
+          </w:tcPr>
+          <w:p>
+            <w:r>
+              <w:rPr>
+                <w:b/>
+                <w:bCs/>
+                <w:sz w:val="20"/>
+                <w:szCs w:val="20"/>
+              </w:rPr>
+              <w:t xml:space="preserve">TC</w:t>
+            </w:r>
+          </w:p>
+        </w:tc>
+        <w:tc>
+          <w:tcPr>
+            <w:tcW w:type="dxa" w:w="1974"/>
+            <w:tcBorders>
+              <w:top w:val="single" w:color="BFBFBF" w:sz="4"/>
+              <w:left w:val="single" w:color="BFBFBF" w:sz="4"/>
+              <w:bottom w:val="single" w:color="BFBFBF" w:sz="4"/>
+              <w:right w:val="single" w:color="BFBFBF" w:sz="4"/>
+            </w:tcBorders>
+            <w:shd w:fill="DCE6F1" w:val="clear"/>
+            <w:tcMar>
+              <w:top w:type="dxa" w:w="60"/>
+              <w:left w:type="dxa" w:w="100"/>
+              <w:bottom w:type="dxa" w:w="60"/>
+              <w:right w:type="dxa" w:w="100"/>
+            </w:tcMar>
+          </w:tcPr>
+          <w:p>
+            <w:r>
+              <w:rPr>
+                <w:b/>
+                <w:bCs/>
+                <w:sz w:val="20"/>
+                <w:szCs w:val="20"/>
+              </w:rPr>
+              <w:t xml:space="preserve">Mac: đồng thời</w:t>
+            </w:r>
+          </w:p>
+        </w:tc>
+        <w:tc>
+          <w:tcPr>
+            <w:tcW w:type="dxa" w:w="2538"/>
+            <w:tcBorders>
+              <w:top w:val="single" w:color="BFBFBF" w:sz="4"/>
+              <w:left w:val="single" w:color="BFBFBF" w:sz="4"/>
+              <w:bottom w:val="single" w:color="BFBFBF" w:sz="4"/>
+              <w:right w:val="single" w:color="BFBFBF" w:sz="4"/>
+            </w:tcBorders>
+            <w:shd w:fill="DCE6F1" w:val="clear"/>
+            <w:tcMar>
+              <w:top w:type="dxa" w:w="60"/>
+              <w:left w:type="dxa" w:w="100"/>
+              <w:bottom w:type="dxa" w:w="60"/>
+              <w:right w:type="dxa" w:w="100"/>
+            </w:tcMar>
+          </w:tcPr>
+          <w:p>
+            <w:r>
+              <w:rPr>
+                <w:b/>
+                <w:bCs/>
+                <w:sz w:val="20"/>
+                <w:szCs w:val="20"/>
+              </w:rPr>
+              <w:t xml:space="preserve">Windows: đồng thời</w:t>
+            </w:r>
+          </w:p>
+        </w:tc>
+        <w:tc>
+          <w:tcPr>
+            <w:tcW w:type="dxa" w:w="2256"/>
+            <w:tcBorders>
+              <w:top w:val="single" w:color="BFBFBF" w:sz="4"/>
+              <w:left w:val="single" w:color="BFBFBF" w:sz="4"/>
+              <w:bottom w:val="single" w:color="BFBFBF" w:sz="4"/>
+              <w:right w:val="single" w:color="BFBFBF" w:sz="4"/>
+            </w:tcBorders>
+            <w:shd w:fill="DCE6F1" w:val="clear"/>
+            <w:tcMar>
+              <w:top w:type="dxa" w:w="60"/>
+              <w:left w:type="dxa" w:w="100"/>
+              <w:bottom w:type="dxa" w:w="60"/>
+              <w:right w:type="dxa" w:w="100"/>
+            </w:tcMar>
+          </w:tcPr>
+          <w:p>
+            <w:r>
+              <w:rPr>
+                <w:b/>
+                <w:bCs/>
+                <w:sz w:val="20"/>
+                <w:szCs w:val="20"/>
+              </w:rPr>
+              <w:t xml:space="preserve">Windows: tuần tự</w:t>
+            </w:r>
+          </w:p>
+        </w:tc>
+        <w:tc>
+          <w:tcPr>
+            <w:tcW w:type="dxa" w:w="1130"/>
+            <w:tcBorders>
+              <w:top w:val="single" w:color="BFBFBF" w:sz="4"/>
+              <w:left w:val="single" w:color="BFBFBF" w:sz="4"/>
+              <w:bottom w:val="single" w:color="BFBFBF" w:sz="4"/>
+              <w:right w:val="single" w:color="BFBFBF" w:sz="4"/>
+            </w:tcBorders>
+            <w:shd w:fill="DCE6F1" w:val="clear"/>
+            <w:tcMar>
+              <w:top w:type="dxa" w:w="60"/>
+              <w:left w:type="dxa" w:w="100"/>
+              <w:bottom w:type="dxa" w:w="60"/>
+              <w:right w:type="dxa" w:w="100"/>
+            </w:tcMar>
+          </w:tcPr>
+          <w:p>
+            <w:r>
+              <w:rPr>
+                <w:b/>
+                <w:bCs/>
+                <w:sz w:val="20"/>
+                <w:szCs w:val="20"/>
+              </w:rPr>
+              <w:t xml:space="preserve">Khớp</w:t>
+            </w:r>
+          </w:p>
+        </w:tc>
+      </w:tr>
+      <w:tr>
+        <w:trPr>
+          <w:tblHeader w:val="off"/>
+        </w:trPr>
+        <w:tc>
+          <w:tcPr>
+            <w:tcW w:type="dxa" w:w="1128"/>
+            <w:tcBorders>
+              <w:top w:val="single" w:color="BFBFBF" w:sz="4"/>
+              <w:left w:val="single" w:color="BFBFBF" w:sz="4"/>
+              <w:bottom w:val="single" w:color="BFBFBF" w:sz="4"/>
+              <w:right w:val="single" w:color="BFBFBF" w:sz="4"/>
+            </w:tcBorders>
+            <w:tcMar>
+              <w:top w:type="dxa" w:w="60"/>
+              <w:left w:type="dxa" w:w="100"/>
+              <w:bottom w:type="dxa" w:w="60"/>
+              <w:right w:type="dxa" w:w="100"/>
+            </w:tcMar>
+          </w:tcPr>
+          <w:p>
+            <w:r>
+              <w:rPr>
+                <w:sz w:val="20"/>
+                <w:szCs w:val="20"/>
+              </w:rPr>
+              <w:t xml:space="preserve">TC-01</w:t>
+            </w:r>
+          </w:p>
+        </w:tc>
+        <w:tc>
+          <w:tcPr>
+            <w:tcW w:type="dxa" w:w="1974"/>
+            <w:tcBorders>
+              <w:top w:val="single" w:color="BFBFBF" w:sz="4"/>
+              <w:left w:val="single" w:color="BFBFBF" w:sz="4"/>
+              <w:bottom w:val="single" w:color="BFBFBF" w:sz="4"/>
+              <w:right w:val="single" w:color="BFBFBF" w:sz="4"/>
+            </w:tcBorders>
+            <w:tcMar>
+              <w:top w:type="dxa" w:w="60"/>
+              <w:left w:type="dxa" w:w="100"/>
+              <w:bottom w:type="dxa" w:w="60"/>
+              <w:right w:type="dxa" w:w="100"/>
+            </w:tcMar>
+          </w:tcPr>
+          <w:p>
+            <w:r>
+              <w:rPr>
+                <w:sz w:val="20"/>
+                <w:szCs w:val="20"/>
+              </w:rPr>
+              <w:t xml:space="preserve">0/10</w:t>
+            </w:r>
+          </w:p>
+        </w:tc>
+        <w:tc>
+          <w:tcPr>
+            <w:tcW w:type="dxa" w:w="2538"/>
+            <w:tcBorders>
+              <w:top w:val="single" w:color="BFBFBF" w:sz="4"/>
+              <w:left w:val="single" w:color="BFBFBF" w:sz="4"/>
+              <w:bottom w:val="single" w:color="BFBFBF" w:sz="4"/>
+              <w:right w:val="single" w:color="BFBFBF" w:sz="4"/>
+            </w:tcBorders>
+            <w:tcMar>
+              <w:top w:type="dxa" w:w="60"/>
+              <w:left w:type="dxa" w:w="100"/>
+              <w:bottom w:type="dxa" w:w="60"/>
+              <w:right w:type="dxa" w:w="100"/>
+            </w:tcMar>
+          </w:tcPr>
+          <w:p>
+            <w:r>
+              <w:rPr>
+                <w:sz w:val="20"/>
+                <w:szCs w:val="20"/>
+              </w:rPr>
+              <w:t xml:space="preserve">0/10</w:t>
+            </w:r>
+          </w:p>
+        </w:tc>
+        <w:tc>
+          <w:tcPr>
+            <w:tcW w:type="dxa" w:w="2256"/>
+            <w:tcBorders>
+              <w:top w:val="single" w:color="BFBFBF" w:sz="4"/>
+              <w:left w:val="single" w:color="BFBFBF" w:sz="4"/>
+              <w:bottom w:val="single" w:color="BFBFBF" w:sz="4"/>
+              <w:right w:val="single" w:color="BFBFBF" w:sz="4"/>
+            </w:tcBorders>
+            <w:tcMar>
+              <w:top w:type="dxa" w:w="60"/>
+              <w:left w:type="dxa" w:w="100"/>
+              <w:bottom w:type="dxa" w:w="60"/>
+              <w:right w:type="dxa" w:w="100"/>
+            </w:tcMar>
+          </w:tcPr>
+          <w:p>
+            <w:r>
+              <w:rPr>
+                <w:sz w:val="20"/>
+                <w:szCs w:val="20"/>
+              </w:rPr>
+              <w:t xml:space="preserve">0/10</w:t>
+            </w:r>
+          </w:p>
+        </w:tc>
+        <w:tc>
+          <w:tcPr>
+            <w:tcW w:type="dxa" w:w="1130"/>
+            <w:tcBorders>
+              <w:top w:val="single" w:color="BFBFBF" w:sz="4"/>
+              <w:left w:val="single" w:color="BFBFBF" w:sz="4"/>
+              <w:bottom w:val="single" w:color="BFBFBF" w:sz="4"/>
+              <w:right w:val="single" w:color="BFBFBF" w:sz="4"/>
+            </w:tcBorders>
+            <w:tcMar>
+              <w:top w:type="dxa" w:w="60"/>
+              <w:left w:type="dxa" w:w="100"/>
+              <w:bottom w:type="dxa" w:w="60"/>
+              <w:right w:type="dxa" w:w="100"/>
+            </w:tcMar>
+          </w:tcPr>
+          <w:p>
+            <w:r>
+              <w:rPr>
+                <w:sz w:val="20"/>
+                <w:szCs w:val="20"/>
+              </w:rPr>
+              <w:t xml:space="preserve">Có</w:t>
+            </w:r>
+          </w:p>
+        </w:tc>
+      </w:tr>
+      <w:tr>
+        <w:trPr>
+          <w:tblHeader w:val="off"/>
+        </w:trPr>
+        <w:tc>
+          <w:tcPr>
+            <w:tcW w:type="dxa" w:w="1128"/>
+            <w:tcBorders>
+              <w:top w:val="single" w:color="BFBFBF" w:sz="4"/>
+              <w:left w:val="single" w:color="BFBFBF" w:sz="4"/>
+              <w:bottom w:val="single" w:color="BFBFBF" w:sz="4"/>
+              <w:right w:val="single" w:color="BFBFBF" w:sz="4"/>
+            </w:tcBorders>
+            <w:tcMar>
+              <w:top w:type="dxa" w:w="60"/>
+              <w:left w:type="dxa" w:w="100"/>
+              <w:bottom w:type="dxa" w:w="60"/>
+              <w:right w:type="dxa" w:w="100"/>
+            </w:tcMar>
+          </w:tcPr>
+          <w:p>
+            <w:r>
+              <w:rPr>
+                <w:sz w:val="20"/>
+                <w:szCs w:val="20"/>
+              </w:rPr>
+              <w:t xml:space="preserve">TC-02</w:t>
+            </w:r>
+          </w:p>
+        </w:tc>
+        <w:tc>
+          <w:tcPr>
+            <w:tcW w:type="dxa" w:w="1974"/>
+            <w:tcBorders>
+              <w:top w:val="single" w:color="BFBFBF" w:sz="4"/>
+              <w:left w:val="single" w:color="BFBFBF" w:sz="4"/>
+              <w:bottom w:val="single" w:color="BFBFBF" w:sz="4"/>
+              <w:right w:val="single" w:color="BFBFBF" w:sz="4"/>
+            </w:tcBorders>
+            <w:tcMar>
+              <w:top w:type="dxa" w:w="60"/>
+              <w:left w:type="dxa" w:w="100"/>
+              <w:bottom w:type="dxa" w:w="60"/>
+              <w:right w:type="dxa" w:w="100"/>
+            </w:tcMar>
+          </w:tcPr>
+          <w:p>
+            <w:r>
+              <w:rPr>
+                <w:sz w:val="20"/>
+                <w:szCs w:val="20"/>
+              </w:rPr>
+              <w:t xml:space="preserve">10/10</w:t>
+            </w:r>
+          </w:p>
+        </w:tc>
+        <w:tc>
+          <w:tcPr>
+            <w:tcW w:type="dxa" w:w="2538"/>
+            <w:tcBorders>
+              <w:top w:val="single" w:color="BFBFBF" w:sz="4"/>
+              <w:left w:val="single" w:color="BFBFBF" w:sz="4"/>
+              <w:bottom w:val="single" w:color="BFBFBF" w:sz="4"/>
+              <w:right w:val="single" w:color="BFBFBF" w:sz="4"/>
+            </w:tcBorders>
+            <w:tcMar>
+              <w:top w:type="dxa" w:w="60"/>
+              <w:left w:type="dxa" w:w="100"/>
+              <w:bottom w:type="dxa" w:w="60"/>
+              <w:right w:type="dxa" w:w="100"/>
+            </w:tcMar>
+          </w:tcPr>
+          <w:p>
+            <w:r>
+              <w:rPr>
+                <w:sz w:val="20"/>
+                <w:szCs w:val="20"/>
+              </w:rPr>
+              <w:t xml:space="preserve">10/10</w:t>
+            </w:r>
+          </w:p>
+        </w:tc>
+        <w:tc>
+          <w:tcPr>
+            <w:tcW w:type="dxa" w:w="2256"/>
+            <w:tcBorders>
+              <w:top w:val="single" w:color="BFBFBF" w:sz="4"/>
+              <w:left w:val="single" w:color="BFBFBF" w:sz="4"/>
+              <w:bottom w:val="single" w:color="BFBFBF" w:sz="4"/>
+              <w:right w:val="single" w:color="BFBFBF" w:sz="4"/>
+            </w:tcBorders>
+            <w:tcMar>
+              <w:top w:type="dxa" w:w="60"/>
+              <w:left w:type="dxa" w:w="100"/>
+              <w:bottom w:type="dxa" w:w="60"/>
+              <w:right w:type="dxa" w:w="100"/>
+            </w:tcMar>
+          </w:tcPr>
+          <w:p>
+            <w:r>
+              <w:rPr>
+                <w:sz w:val="20"/>
+                <w:szCs w:val="20"/>
+              </w:rPr>
+              <w:t xml:space="preserve">0/10</w:t>
+            </w:r>
+          </w:p>
+        </w:tc>
+        <w:tc>
+          <w:tcPr>
+            <w:tcW w:type="dxa" w:w="1130"/>
+            <w:tcBorders>
+              <w:top w:val="single" w:color="BFBFBF" w:sz="4"/>
+              <w:left w:val="single" w:color="BFBFBF" w:sz="4"/>
+              <w:bottom w:val="single" w:color="BFBFBF" w:sz="4"/>
+              <w:right w:val="single" w:color="BFBFBF" w:sz="4"/>
+            </w:tcBorders>
+            <w:tcMar>
+              <w:top w:type="dxa" w:w="60"/>
+              <w:left w:type="dxa" w:w="100"/>
+              <w:bottom w:type="dxa" w:w="60"/>
+              <w:right w:type="dxa" w:w="100"/>
+            </w:tcMar>
+          </w:tcPr>
+          <w:p>
+            <w:r>
+              <w:rPr>
+                <w:sz w:val="20"/>
+                <w:szCs w:val="20"/>
+              </w:rPr>
+              <w:t xml:space="preserve">Có</w:t>
+            </w:r>
+          </w:p>
+        </w:tc>
+      </w:tr>
+      <w:tr>
+        <w:trPr>
+          <w:tblHeader w:val="off"/>
+        </w:trPr>
+        <w:tc>
+          <w:tcPr>
+            <w:tcW w:type="dxa" w:w="1128"/>
+            <w:tcBorders>
+              <w:top w:val="single" w:color="BFBFBF" w:sz="4"/>
+              <w:left w:val="single" w:color="BFBFBF" w:sz="4"/>
+              <w:bottom w:val="single" w:color="BFBFBF" w:sz="4"/>
+              <w:right w:val="single" w:color="BFBFBF" w:sz="4"/>
+            </w:tcBorders>
+            <w:tcMar>
+              <w:top w:type="dxa" w:w="60"/>
+              <w:left w:type="dxa" w:w="100"/>
+              <w:bottom w:type="dxa" w:w="60"/>
+              <w:right w:type="dxa" w:w="100"/>
+            </w:tcMar>
+          </w:tcPr>
+          <w:p>
+            <w:r>
+              <w:rPr>
+                <w:sz w:val="20"/>
+                <w:szCs w:val="20"/>
+              </w:rPr>
+              <w:t xml:space="preserve">TC-03</w:t>
+            </w:r>
+          </w:p>
+        </w:tc>
+        <w:tc>
+          <w:tcPr>
+            <w:tcW w:type="dxa" w:w="1974"/>
+            <w:tcBorders>
+              <w:top w:val="single" w:color="BFBFBF" w:sz="4"/>
+              <w:left w:val="single" w:color="BFBFBF" w:sz="4"/>
+              <w:bottom w:val="single" w:color="BFBFBF" w:sz="4"/>
+              <w:right w:val="single" w:color="BFBFBF" w:sz="4"/>
+            </w:tcBorders>
+            <w:tcMar>
+              <w:top w:type="dxa" w:w="60"/>
+              <w:left w:type="dxa" w:w="100"/>
+              <w:bottom w:type="dxa" w:w="60"/>
+              <w:right w:type="dxa" w:w="100"/>
+            </w:tcMar>
+          </w:tcPr>
+          <w:p>
+            <w:r>
+              <w:rPr>
+                <w:sz w:val="20"/>
+                <w:szCs w:val="20"/>
+              </w:rPr>
+              <w:t xml:space="preserve">10/10</w:t>
+            </w:r>
+          </w:p>
+        </w:tc>
+        <w:tc>
+          <w:tcPr>
+            <w:tcW w:type="dxa" w:w="2538"/>
+            <w:tcBorders>
+              <w:top w:val="single" w:color="BFBFBF" w:sz="4"/>
+              <w:left w:val="single" w:color="BFBFBF" w:sz="4"/>
+              <w:bottom w:val="single" w:color="BFBFBF" w:sz="4"/>
+              <w:right w:val="single" w:color="BFBFBF" w:sz="4"/>
+            </w:tcBorders>
+            <w:tcMar>
+              <w:top w:type="dxa" w:w="60"/>
+              <w:left w:type="dxa" w:w="100"/>
+              <w:bottom w:type="dxa" w:w="60"/>
+              <w:right w:type="dxa" w:w="100"/>
+            </w:tcMar>
+          </w:tcPr>
+          <w:p>
+            <w:r>
+              <w:rPr>
+                <w:sz w:val="20"/>
+                <w:szCs w:val="20"/>
+              </w:rPr>
+              <w:t xml:space="preserve">10/10</w:t>
+            </w:r>
+          </w:p>
+        </w:tc>
+        <w:tc>
+          <w:tcPr>
+            <w:tcW w:type="dxa" w:w="2256"/>
+            <w:tcBorders>
+              <w:top w:val="single" w:color="BFBFBF" w:sz="4"/>
+              <w:left w:val="single" w:color="BFBFBF" w:sz="4"/>
+              <w:bottom w:val="single" w:color="BFBFBF" w:sz="4"/>
+              <w:right w:val="single" w:color="BFBFBF" w:sz="4"/>
+            </w:tcBorders>
+            <w:tcMar>
+              <w:top w:type="dxa" w:w="60"/>
+              <w:left w:type="dxa" w:w="100"/>
+              <w:bottom w:type="dxa" w:w="60"/>
+              <w:right w:type="dxa" w:w="100"/>
+            </w:tcMar>
+          </w:tcPr>
+          <w:p>
+            <w:r>
+              <w:rPr>
+                <w:sz w:val="20"/>
+                <w:szCs w:val="20"/>
+              </w:rPr>
+              <w:t xml:space="preserve">0/10</w:t>
+            </w:r>
+          </w:p>
+        </w:tc>
+        <w:tc>
+          <w:tcPr>
+            <w:tcW w:type="dxa" w:w="1130"/>
+            <w:tcBorders>
+              <w:top w:val="single" w:color="BFBFBF" w:sz="4"/>
+              <w:left w:val="single" w:color="BFBFBF" w:sz="4"/>
+              <w:bottom w:val="single" w:color="BFBFBF" w:sz="4"/>
+              <w:right w:val="single" w:color="BFBFBF" w:sz="4"/>
+            </w:tcBorders>
+            <w:tcMar>
+              <w:top w:type="dxa" w:w="60"/>
+              <w:left w:type="dxa" w:w="100"/>
+              <w:bottom w:type="dxa" w:w="60"/>
+              <w:right w:type="dxa" w:w="100"/>
+            </w:tcMar>
+          </w:tcPr>
+          <w:p>
+            <w:r>
+              <w:rPr>
+                <w:sz w:val="20"/>
+                <w:szCs w:val="20"/>
+              </w:rPr>
+              <w:t xml:space="preserve">Có</w:t>
+            </w:r>
+          </w:p>
+        </w:tc>
+      </w:tr>
+      <w:tr>
+        <w:trPr>
+          <w:tblHeader w:val="off"/>
+        </w:trPr>
+        <w:tc>
+          <w:tcPr>
+            <w:tcW w:type="dxa" w:w="1128"/>
+            <w:tcBorders>
+              <w:top w:val="single" w:color="BFBFBF" w:sz="4"/>
+              <w:left w:val="single" w:color="BFBFBF" w:sz="4"/>
+              <w:bottom w:val="single" w:color="BFBFBF" w:sz="4"/>
+              <w:right w:val="single" w:color="BFBFBF" w:sz="4"/>
+            </w:tcBorders>
+            <w:tcMar>
+              <w:top w:type="dxa" w:w="60"/>
+              <w:left w:type="dxa" w:w="100"/>
+              <w:bottom w:type="dxa" w:w="60"/>
+              <w:right w:type="dxa" w:w="100"/>
+            </w:tcMar>
+          </w:tcPr>
+          <w:p>
+            <w:r>
+              <w:rPr>
+                <w:sz w:val="20"/>
+                <w:szCs w:val="20"/>
+              </w:rPr>
+              <w:t xml:space="preserve">TC-04</w:t>
+            </w:r>
+          </w:p>
+        </w:tc>
+        <w:tc>
+          <w:tcPr>
+            <w:tcW w:type="dxa" w:w="1974"/>
+            <w:tcBorders>
+              <w:top w:val="single" w:color="BFBFBF" w:sz="4"/>
+              <w:left w:val="single" w:color="BFBFBF" w:sz="4"/>
+              <w:bottom w:val="single" w:color="BFBFBF" w:sz="4"/>
+              <w:right w:val="single" w:color="BFBFBF" w:sz="4"/>
+            </w:tcBorders>
+            <w:tcMar>
+              <w:top w:type="dxa" w:w="60"/>
+              <w:left w:type="dxa" w:w="100"/>
+              <w:bottom w:type="dxa" w:w="60"/>
+              <w:right w:type="dxa" w:w="100"/>
+            </w:tcMar>
+          </w:tcPr>
+          <w:p>
+            <w:r>
+              <w:rPr>
+                <w:sz w:val="20"/>
+                <w:szCs w:val="20"/>
+              </w:rPr>
+              <w:t xml:space="preserve">0/10</w:t>
+            </w:r>
+          </w:p>
+        </w:tc>
+        <w:tc>
+          <w:tcPr>
+            <w:tcW w:type="dxa" w:w="2538"/>
+            <w:tcBorders>
+              <w:top w:val="single" w:color="BFBFBF" w:sz="4"/>
+              <w:left w:val="single" w:color="BFBFBF" w:sz="4"/>
+              <w:bottom w:val="single" w:color="BFBFBF" w:sz="4"/>
+              <w:right w:val="single" w:color="BFBFBF" w:sz="4"/>
+            </w:tcBorders>
+            <w:tcMar>
+              <w:top w:type="dxa" w:w="60"/>
+              <w:left w:type="dxa" w:w="100"/>
+              <w:bottom w:type="dxa" w:w="60"/>
+              <w:right w:type="dxa" w:w="100"/>
+            </w:tcMar>
+          </w:tcPr>
+          <w:p>
+            <w:r>
+              <w:rPr>
+                <w:sz w:val="20"/>
+                <w:szCs w:val="20"/>
+              </w:rPr>
+              <w:t xml:space="preserve">0/10</w:t>
+            </w:r>
+          </w:p>
+        </w:tc>
+        <w:tc>
+          <w:tcPr>
+            <w:tcW w:type="dxa" w:w="2256"/>
+            <w:tcBorders>
+              <w:top w:val="single" w:color="BFBFBF" w:sz="4"/>
+              <w:left w:val="single" w:color="BFBFBF" w:sz="4"/>
+              <w:bottom w:val="single" w:color="BFBFBF" w:sz="4"/>
+              <w:right w:val="single" w:color="BFBFBF" w:sz="4"/>
+            </w:tcBorders>
+            <w:tcMar>
+              <w:top w:type="dxa" w:w="60"/>
+              <w:left w:type="dxa" w:w="100"/>
+              <w:bottom w:type="dxa" w:w="60"/>
+              <w:right w:type="dxa" w:w="100"/>
+            </w:tcMar>
+          </w:tcPr>
+          <w:p>
+            <w:r>
+              <w:rPr>
+                <w:sz w:val="20"/>
+                <w:szCs w:val="20"/>
+              </w:rPr>
+              <w:t xml:space="preserve">0/10</w:t>
+            </w:r>
+          </w:p>
+        </w:tc>
+        <w:tc>
+          <w:tcPr>
+            <w:tcW w:type="dxa" w:w="1130"/>
+            <w:tcBorders>
+              <w:top w:val="single" w:color="BFBFBF" w:sz="4"/>
+              <w:left w:val="single" w:color="BFBFBF" w:sz="4"/>
+              <w:bottom w:val="single" w:color="BFBFBF" w:sz="4"/>
+              <w:right w:val="single" w:color="BFBFBF" w:sz="4"/>
+            </w:tcBorders>
+            <w:tcMar>
+              <w:top w:type="dxa" w:w="60"/>
+              <w:left w:type="dxa" w:w="100"/>
+              <w:bottom w:type="dxa" w:w="60"/>
+              <w:right w:type="dxa" w:w="100"/>
+            </w:tcMar>
+          </w:tcPr>
+          <w:p>
+            <w:r>
+              <w:rPr>
+                <w:sz w:val="20"/>
+                <w:szCs w:val="20"/>
+              </w:rPr>
+              <w:t xml:space="preserve">Có</w:t>
+            </w:r>
+          </w:p>
+        </w:tc>
+      </w:tr>
+      <w:tr>
+        <w:trPr>
+          <w:tblHeader w:val="off"/>
+        </w:trPr>
+        <w:tc>
+          <w:tcPr>
+            <w:tcW w:type="dxa" w:w="1128"/>
+            <w:tcBorders>
+              <w:top w:val="single" w:color="BFBFBF" w:sz="4"/>
+              <w:left w:val="single" w:color="BFBFBF" w:sz="4"/>
+              <w:bottom w:val="single" w:color="BFBFBF" w:sz="4"/>
+              <w:right w:val="single" w:color="BFBFBF" w:sz="4"/>
+            </w:tcBorders>
+            <w:tcMar>
+              <w:top w:type="dxa" w:w="60"/>
+              <w:left w:type="dxa" w:w="100"/>
+              <w:bottom w:type="dxa" w:w="60"/>
+              <w:right w:type="dxa" w:w="100"/>
+            </w:tcMar>
+          </w:tcPr>
+          <w:p>
+            <w:r>
+              <w:rPr>
+                <w:sz w:val="20"/>
+                <w:szCs w:val="20"/>
+              </w:rPr>
+              <w:t xml:space="preserve">TC-05</w:t>
+            </w:r>
+          </w:p>
+        </w:tc>
+        <w:tc>
+          <w:tcPr>
+            <w:tcW w:type="dxa" w:w="1974"/>
+            <w:tcBorders>
+              <w:top w:val="single" w:color="BFBFBF" w:sz="4"/>
+              <w:left w:val="single" w:color="BFBFBF" w:sz="4"/>
+              <w:bottom w:val="single" w:color="BFBFBF" w:sz="4"/>
+              <w:right w:val="single" w:color="BFBFBF" w:sz="4"/>
+            </w:tcBorders>
+            <w:tcMar>
+              <w:top w:type="dxa" w:w="60"/>
+              <w:left w:type="dxa" w:w="100"/>
+              <w:bottom w:type="dxa" w:w="60"/>
+              <w:right w:type="dxa" w:w="100"/>
+            </w:tcMar>
+          </w:tcPr>
+          <w:p>
+            <w:r>
+              <w:rPr>
+                <w:sz w:val="20"/>
+                <w:szCs w:val="20"/>
+              </w:rPr>
+              <w:t xml:space="preserve">10/10</w:t>
+            </w:r>
+          </w:p>
+        </w:tc>
+        <w:tc>
+          <w:tcPr>
+            <w:tcW w:type="dxa" w:w="2538"/>
+            <w:tcBorders>
+              <w:top w:val="single" w:color="BFBFBF" w:sz="4"/>
+              <w:left w:val="single" w:color="BFBFBF" w:sz="4"/>
+              <w:bottom w:val="single" w:color="BFBFBF" w:sz="4"/>
+              <w:right w:val="single" w:color="BFBFBF" w:sz="4"/>
+            </w:tcBorders>
+            <w:tcMar>
+              <w:top w:type="dxa" w:w="60"/>
+              <w:left w:type="dxa" w:w="100"/>
+              <w:bottom w:type="dxa" w:w="60"/>
+              <w:right w:type="dxa" w:w="100"/>
+            </w:tcMar>
+          </w:tcPr>
+          <w:p>
+            <w:r>
+              <w:rPr>
+                <w:sz w:val="20"/>
+                <w:szCs w:val="20"/>
+              </w:rPr>
+              <w:t xml:space="preserve">10/10</w:t>
+            </w:r>
+          </w:p>
+        </w:tc>
+        <w:tc>
+          <w:tcPr>
+            <w:tcW w:type="dxa" w:w="2256"/>
+            <w:tcBorders>
+              <w:top w:val="single" w:color="BFBFBF" w:sz="4"/>
+              <w:left w:val="single" w:color="BFBFBF" w:sz="4"/>
+              <w:bottom w:val="single" w:color="BFBFBF" w:sz="4"/>
+              <w:right w:val="single" w:color="BFBFBF" w:sz="4"/>
+            </w:tcBorders>
+            <w:tcMar>
+              <w:top w:type="dxa" w:w="60"/>
+              <w:left w:type="dxa" w:w="100"/>
+              <w:bottom w:type="dxa" w:w="60"/>
+              <w:right w:type="dxa" w:w="100"/>
+            </w:tcMar>
+          </w:tcPr>
+          <w:p>
+            <w:r>
+              <w:rPr>
+                <w:sz w:val="20"/>
+                <w:szCs w:val="20"/>
+              </w:rPr>
+              <w:t xml:space="preserve">0/10</w:t>
+            </w:r>
+          </w:p>
+        </w:tc>
+        <w:tc>
+          <w:tcPr>
+            <w:tcW w:type="dxa" w:w="1130"/>
+            <w:tcBorders>
+              <w:top w:val="single" w:color="BFBFBF" w:sz="4"/>
+              <w:left w:val="single" w:color="BFBFBF" w:sz="4"/>
+              <w:bottom w:val="single" w:color="BFBFBF" w:sz="4"/>
+              <w:right w:val="single" w:color="BFBFBF" w:sz="4"/>
+            </w:tcBorders>
+            <w:tcMar>
+              <w:top w:type="dxa" w:w="60"/>
+              <w:left w:type="dxa" w:w="100"/>
+              <w:bottom w:type="dxa" w:w="60"/>
+              <w:right w:type="dxa" w:w="100"/>
+            </w:tcMar>
+          </w:tcPr>
+          <w:p>
+            <w:r>
+              <w:rPr>
+                <w:sz w:val="20"/>
+                <w:szCs w:val="20"/>
+              </w:rPr>
+              <w:t xml:space="preserve">Có</w:t>
+            </w:r>
+          </w:p>
+        </w:tc>
+      </w:tr>
+      <w:tr>
+        <w:trPr>
+          <w:tblHeader w:val="off"/>
+        </w:trPr>
+        <w:tc>
+          <w:tcPr>
+            <w:tcW w:type="dxa" w:w="1128"/>
+            <w:tcBorders>
+              <w:top w:val="single" w:color="BFBFBF" w:sz="4"/>
+              <w:left w:val="single" w:color="BFBFBF" w:sz="4"/>
+              <w:bottom w:val="single" w:color="BFBFBF" w:sz="4"/>
+              <w:right w:val="single" w:color="BFBFBF" w:sz="4"/>
+            </w:tcBorders>
+            <w:tcMar>
+              <w:top w:type="dxa" w:w="60"/>
+              <w:left w:type="dxa" w:w="100"/>
+              <w:bottom w:type="dxa" w:w="60"/>
+              <w:right w:type="dxa" w:w="100"/>
+            </w:tcMar>
+          </w:tcPr>
+          <w:p>
+            <w:r>
+              <w:rPr>
+                <w:sz w:val="20"/>
+                <w:szCs w:val="20"/>
+              </w:rPr>
+              <w:t xml:space="preserve">TC-06</w:t>
+            </w:r>
+          </w:p>
+        </w:tc>
+        <w:tc>
+          <w:tcPr>
+            <w:tcW w:type="dxa" w:w="1974"/>
+            <w:tcBorders>
+              <w:top w:val="single" w:color="BFBFBF" w:sz="4"/>
+              <w:left w:val="single" w:color="BFBFBF" w:sz="4"/>
+              <w:bottom w:val="single" w:color="BFBFBF" w:sz="4"/>
+              <w:right w:val="single" w:color="BFBFBF" w:sz="4"/>
+            </w:tcBorders>
+            <w:tcMar>
+              <w:top w:type="dxa" w:w="60"/>
+              <w:left w:type="dxa" w:w="100"/>
+              <w:bottom w:type="dxa" w:w="60"/>
+              <w:right w:type="dxa" w:w="100"/>
+            </w:tcMar>
+          </w:tcPr>
+          <w:p>
+            <w:r>
+              <w:rPr>
+                <w:sz w:val="20"/>
+                <w:szCs w:val="20"/>
+              </w:rPr>
+              <w:t xml:space="preserve">10/10</w:t>
+            </w:r>
+          </w:p>
+        </w:tc>
+        <w:tc>
+          <w:tcPr>
+            <w:tcW w:type="dxa" w:w="2538"/>
+            <w:tcBorders>
+              <w:top w:val="single" w:color="BFBFBF" w:sz="4"/>
+              <w:left w:val="single" w:color="BFBFBF" w:sz="4"/>
+              <w:bottom w:val="single" w:color="BFBFBF" w:sz="4"/>
+              <w:right w:val="single" w:color="BFBFBF" w:sz="4"/>
+            </w:tcBorders>
+            <w:tcMar>
+              <w:top w:type="dxa" w:w="60"/>
+              <w:left w:type="dxa" w:w="100"/>
+              <w:bottom w:type="dxa" w:w="60"/>
+              <w:right w:type="dxa" w:w="100"/>
+            </w:tcMar>
+          </w:tcPr>
+          <w:p>
+            <w:r>
+              <w:rPr>
+                <w:sz w:val="20"/>
+                <w:szCs w:val="20"/>
+              </w:rPr>
+              <w:t xml:space="preserve">10/10</w:t>
+            </w:r>
+          </w:p>
+        </w:tc>
+        <w:tc>
+          <w:tcPr>
+            <w:tcW w:type="dxa" w:w="2256"/>
+            <w:tcBorders>
+              <w:top w:val="single" w:color="BFBFBF" w:sz="4"/>
+              <w:left w:val="single" w:color="BFBFBF" w:sz="4"/>
+              <w:bottom w:val="single" w:color="BFBFBF" w:sz="4"/>
+              <w:right w:val="single" w:color="BFBFBF" w:sz="4"/>
+            </w:tcBorders>
+            <w:tcMar>
+              <w:top w:type="dxa" w:w="60"/>
+              <w:left w:type="dxa" w:w="100"/>
+              <w:bottom w:type="dxa" w:w="60"/>
+              <w:right w:type="dxa" w:w="100"/>
+            </w:tcMar>
+          </w:tcPr>
+          <w:p>
+            <w:r>
+              <w:rPr>
+                <w:sz w:val="20"/>
+                <w:szCs w:val="20"/>
+              </w:rPr>
+              <w:t xml:space="preserve">10/10</w:t>
+            </w:r>
+          </w:p>
+        </w:tc>
+        <w:tc>
+          <w:tcPr>
+            <w:tcW w:type="dxa" w:w="1130"/>
+            <w:tcBorders>
+              <w:top w:val="single" w:color="BFBFBF" w:sz="4"/>
+              <w:left w:val="single" w:color="BFBFBF" w:sz="4"/>
+              <w:bottom w:val="single" w:color="BFBFBF" w:sz="4"/>
+              <w:right w:val="single" w:color="BFBFBF" w:sz="4"/>
+            </w:tcBorders>
+            <w:tcMar>
+              <w:top w:type="dxa" w:w="60"/>
+              <w:left w:type="dxa" w:w="100"/>
+              <w:bottom w:type="dxa" w:w="60"/>
+              <w:right w:type="dxa" w:w="100"/>
+            </w:tcMar>
+          </w:tcPr>
+          <w:p>
+            <w:r>
+              <w:rPr>
+                <w:sz w:val="20"/>
+                <w:szCs w:val="20"/>
+              </w:rPr>
+              <w:t xml:space="preserve">Có</w:t>
+            </w:r>
+          </w:p>
+        </w:tc>
+      </w:tr>
+      <w:tr>
+        <w:trPr>
+          <w:tblHeader w:val="off"/>
+        </w:trPr>
+        <w:tc>
+          <w:tcPr>
+            <w:tcW w:type="dxa" w:w="1128"/>
+            <w:tcBorders>
+              <w:top w:val="single" w:color="BFBFBF" w:sz="4"/>
+              <w:left w:val="single" w:color="BFBFBF" w:sz="4"/>
+              <w:bottom w:val="single" w:color="BFBFBF" w:sz="4"/>
+              <w:right w:val="single" w:color="BFBFBF" w:sz="4"/>
+            </w:tcBorders>
+            <w:tcMar>
+              <w:top w:type="dxa" w:w="60"/>
+              <w:left w:type="dxa" w:w="100"/>
+              <w:bottom w:type="dxa" w:w="60"/>
+              <w:right w:type="dxa" w:w="100"/>
+            </w:tcMar>
+          </w:tcPr>
+          <w:p>
+            <w:r>
+              <w:rPr>
+                <w:sz w:val="20"/>
+                <w:szCs w:val="20"/>
+              </w:rPr>
+              <w:t xml:space="preserve">TC-07</w:t>
+            </w:r>
+          </w:p>
+        </w:tc>
+        <w:tc>
+          <w:tcPr>
+            <w:tcW w:type="dxa" w:w="1974"/>
+            <w:tcBorders>
+              <w:top w:val="single" w:color="BFBFBF" w:sz="4"/>
+              <w:left w:val="single" w:color="BFBFBF" w:sz="4"/>
+              <w:bottom w:val="single" w:color="BFBFBF" w:sz="4"/>
+              <w:right w:val="single" w:color="BFBFBF" w:sz="4"/>
+            </w:tcBorders>
+            <w:tcMar>
+              <w:top w:type="dxa" w:w="60"/>
+              <w:left w:type="dxa" w:w="100"/>
+              <w:bottom w:type="dxa" w:w="60"/>
+              <w:right w:type="dxa" w:w="100"/>
+            </w:tcMar>
+          </w:tcPr>
+          <w:p>
+            <w:r>
+              <w:rPr>
+                <w:sz w:val="20"/>
+                <w:szCs w:val="20"/>
+              </w:rPr>
+              <w:t xml:space="preserve">10/10</w:t>
+            </w:r>
+          </w:p>
+        </w:tc>
+        <w:tc>
+          <w:tcPr>
+            <w:tcW w:type="dxa" w:w="2538"/>
+            <w:tcBorders>
+              <w:top w:val="single" w:color="BFBFBF" w:sz="4"/>
+              <w:left w:val="single" w:color="BFBFBF" w:sz="4"/>
+              <w:bottom w:val="single" w:color="BFBFBF" w:sz="4"/>
+              <w:right w:val="single" w:color="BFBFBF" w:sz="4"/>
+            </w:tcBorders>
+            <w:tcMar>
+              <w:top w:type="dxa" w:w="60"/>
+              <w:left w:type="dxa" w:w="100"/>
+              <w:bottom w:type="dxa" w:w="60"/>
+              <w:right w:type="dxa" w:w="100"/>
+            </w:tcMar>
+          </w:tcPr>
+          <w:p>
+            <w:r>
+              <w:rPr>
+                <w:sz w:val="20"/>
+                <w:szCs w:val="20"/>
+              </w:rPr>
+              <w:t xml:space="preserve">10/10</w:t>
+            </w:r>
+          </w:p>
+        </w:tc>
+        <w:tc>
+          <w:tcPr>
+            <w:tcW w:type="dxa" w:w="2256"/>
+            <w:tcBorders>
+              <w:top w:val="single" w:color="BFBFBF" w:sz="4"/>
+              <w:left w:val="single" w:color="BFBFBF" w:sz="4"/>
+              <w:bottom w:val="single" w:color="BFBFBF" w:sz="4"/>
+              <w:right w:val="single" w:color="BFBFBF" w:sz="4"/>
+            </w:tcBorders>
+            <w:tcMar>
+              <w:top w:type="dxa" w:w="60"/>
+              <w:left w:type="dxa" w:w="100"/>
+              <w:bottom w:type="dxa" w:w="60"/>
+              <w:right w:type="dxa" w:w="100"/>
+            </w:tcMar>
+          </w:tcPr>
+          <w:p>
+            <w:r>
+              <w:rPr>
+                <w:sz w:val="20"/>
+                <w:szCs w:val="20"/>
+              </w:rPr>
+              <w:t xml:space="preserve">0/10</w:t>
+            </w:r>
+          </w:p>
+        </w:tc>
+        <w:tc>
+          <w:tcPr>
+            <w:tcW w:type="dxa" w:w="1130"/>
+            <w:tcBorders>
+              <w:top w:val="single" w:color="BFBFBF" w:sz="4"/>
+              <w:left w:val="single" w:color="BFBFBF" w:sz="4"/>
+              <w:bottom w:val="single" w:color="BFBFBF" w:sz="4"/>
+              <w:right w:val="single" w:color="BFBFBF" w:sz="4"/>
+            </w:tcBorders>
+            <w:tcMar>
+              <w:top w:type="dxa" w:w="60"/>
+              <w:left w:type="dxa" w:w="100"/>
+              <w:bottom w:type="dxa" w:w="60"/>
+              <w:right w:type="dxa" w:w="100"/>
+            </w:tcMar>
+          </w:tcPr>
+          <w:p>
+            <w:r>
+              <w:rPr>
+                <w:sz w:val="20"/>
+                <w:szCs w:val="20"/>
+              </w:rPr>
+              <w:t xml:space="preserve">Có</w:t>
+            </w:r>
+          </w:p>
+        </w:tc>
+      </w:tr>
+      <w:tr>
+        <w:trPr>
+          <w:tblHeader w:val="off"/>
+        </w:trPr>
+        <w:tc>
+          <w:tcPr>
+            <w:tcW w:type="dxa" w:w="1128"/>
+            <w:tcBorders>
+              <w:top w:val="single" w:color="BFBFBF" w:sz="4"/>
+              <w:left w:val="single" w:color="BFBFBF" w:sz="4"/>
+              <w:bottom w:val="single" w:color="BFBFBF" w:sz="4"/>
+              <w:right w:val="single" w:color="BFBFBF" w:sz="4"/>
+            </w:tcBorders>
+            <w:tcMar>
+              <w:top w:type="dxa" w:w="60"/>
+              <w:left w:type="dxa" w:w="100"/>
+              <w:bottom w:type="dxa" w:w="60"/>
+              <w:right w:type="dxa" w:w="100"/>
+            </w:tcMar>
+          </w:tcPr>
+          <w:p>
+            <w:r>
+              <w:rPr>
+                <w:sz w:val="20"/>
+                <w:szCs w:val="20"/>
+              </w:rPr>
+              <w:t xml:space="preserve">TC-08</w:t>
+            </w:r>
+          </w:p>
+        </w:tc>
+        <w:tc>
+          <w:tcPr>
+            <w:tcW w:type="dxa" w:w="1974"/>
+            <w:tcBorders>
+              <w:top w:val="single" w:color="BFBFBF" w:sz="4"/>
+              <w:left w:val="single" w:color="BFBFBF" w:sz="4"/>
+              <w:bottom w:val="single" w:color="BFBFBF" w:sz="4"/>
+              <w:right w:val="single" w:color="BFBFBF" w:sz="4"/>
+            </w:tcBorders>
+            <w:tcMar>
+              <w:top w:type="dxa" w:w="60"/>
+              <w:left w:type="dxa" w:w="100"/>
+              <w:bottom w:type="dxa" w:w="60"/>
+              <w:right w:type="dxa" w:w="100"/>
+            </w:tcMar>
+          </w:tcPr>
+          <w:p>
+            <w:r>
+              <w:rPr>
+                <w:sz w:val="20"/>
+                <w:szCs w:val="20"/>
+              </w:rPr>
+              <w:t xml:space="preserve">10/10</w:t>
+            </w:r>
+          </w:p>
+        </w:tc>
+        <w:tc>
+          <w:tcPr>
+            <w:tcW w:type="dxa" w:w="2538"/>
+            <w:tcBorders>
+              <w:top w:val="single" w:color="BFBFBF" w:sz="4"/>
+              <w:left w:val="single" w:color="BFBFBF" w:sz="4"/>
+              <w:bottom w:val="single" w:color="BFBFBF" w:sz="4"/>
+              <w:right w:val="single" w:color="BFBFBF" w:sz="4"/>
+            </w:tcBorders>
+            <w:tcMar>
+              <w:top w:type="dxa" w:w="60"/>
+              <w:left w:type="dxa" w:w="100"/>
+              <w:bottom w:type="dxa" w:w="60"/>
+              <w:right w:type="dxa" w:w="100"/>
+            </w:tcMar>
+          </w:tcPr>
+          <w:p>
+            <w:r>
+              <w:rPr>
+                <w:sz w:val="20"/>
+                <w:szCs w:val="20"/>
+              </w:rPr>
+              <w:t xml:space="preserve">10/10</w:t>
+            </w:r>
+          </w:p>
+        </w:tc>
+        <w:tc>
+          <w:tcPr>
+            <w:tcW w:type="dxa" w:w="2256"/>
+            <w:tcBorders>
+              <w:top w:val="single" w:color="BFBFBF" w:sz="4"/>
+              <w:left w:val="single" w:color="BFBFBF" w:sz="4"/>
+              <w:bottom w:val="single" w:color="BFBFBF" w:sz="4"/>
+              <w:right w:val="single" w:color="BFBFBF" w:sz="4"/>
+            </w:tcBorders>
+            <w:tcMar>
+              <w:top w:type="dxa" w:w="60"/>
+              <w:left w:type="dxa" w:w="100"/>
+              <w:bottom w:type="dxa" w:w="60"/>
+              <w:right w:type="dxa" w:w="100"/>
+            </w:tcMar>
+          </w:tcPr>
+          <w:p>
+            <w:r>
+              <w:rPr>
+                <w:sz w:val="20"/>
+                <w:szCs w:val="20"/>
+              </w:rPr>
+              <w:t xml:space="preserve">0/10</w:t>
+            </w:r>
+          </w:p>
+        </w:tc>
+        <w:tc>
+          <w:tcPr>
+            <w:tcW w:type="dxa" w:w="1130"/>
+            <w:tcBorders>
+              <w:top w:val="single" w:color="BFBFBF" w:sz="4"/>
+              <w:left w:val="single" w:color="BFBFBF" w:sz="4"/>
+              <w:bottom w:val="single" w:color="BFBFBF" w:sz="4"/>
+              <w:right w:val="single" w:color="BFBFBF" w:sz="4"/>
+            </w:tcBorders>
+            <w:tcMar>
+              <w:top w:type="dxa" w:w="60"/>
+              <w:left w:type="dxa" w:w="100"/>
+              <w:bottom w:type="dxa" w:w="60"/>
+              <w:right w:type="dxa" w:w="100"/>
+            </w:tcMar>
+          </w:tcPr>
+          <w:p>
+            <w:r>
+              <w:rPr>
+                <w:sz w:val="20"/>
+                <w:szCs w:val="20"/>
+              </w:rPr>
+              <w:t xml:space="preserve">Có</w:t>
+            </w:r>
+          </w:p>
+        </w:tc>
+      </w:tr>
+    </w:tbl>
+    <w:p>
+      <w:pPr>
+        <w:spacing w:after="160"/>
+      </w:pPr>
+    </w:p>
+    <w:p>
+      <w:pPr>
+        <w:spacing w:after="120" w:line="300"/>
+      </w:pPr>
+      <w:r>
+        <w:rPr>
+          <w:b/>
+          <w:bCs/>
+        </w:rPr>
+        <w:t xml:space="preserve">Nhận xét</w:t>
+      </w:r>
+    </w:p>
+    <w:p>
+      <w:pPr>
+        <w:pStyle w:val="ListParagraph"/>
+        <w:numPr>
+          <w:ilvl w:val="0"/>
+          <w:numId w:val="3"/>
+        </w:numPr>
+        <w:spacing w:after="60"/>
+      </w:pPr>
+      <w:r>
+        <w:t xml:space="preserve">Kết luận 8/8 test case giống nhau trên hai máy. Số vòng vi phạm và dữ liệu trong CSDL ở vòng 1 giống hệt, trừ TC-05: máy Mac nhận 9 booking chờ xác nhận (1 request bị 409), máy Windows nhận 10. Cả hai đều vi phạm 10/10 vòng, khác nhau ở thời điểm chạm cửa sổ race.</w:t>
+      </w:r>
+    </w:p>
+    <w:p>
+      <w:pPr>
+        <w:pStyle w:val="ListParagraph"/>
+        <w:numPr>
+          <w:ilvl w:val="0"/>
+          <w:numId w:val="3"/>
+        </w:numPr>
+        <w:spacing w:after="60"/>
+      </w:pPr>
+      <w:r>
+        <w:t xml:space="preserve">Máy Windows chậm hơn: lượt đồng thời chạy 210 giây so với 154 giây trên máy Mac. Độ trễ p95 của TC-01 là 9 703 ms trên Windows so với 417 ms trên Mac. Nhiều khả năng do Cal.com biên dịch lần đầu ở vòng đầu, nhóm chưa kiểm chứng.</w:t>
+      </w:r>
+    </w:p>
+    <w:p>
+      <w:pPr>
+        <w:pStyle w:val="ListParagraph"/>
+        <w:numPr>
+          <w:ilvl w:val="0"/>
+          <w:numId w:val="3"/>
+        </w:numPr>
+        <w:spacing w:after="60"/>
+      </w:pPr>
+      <w:r>
+        <w:t xml:space="preserve">Lượt tuần tự trên Windows: chỉ TC-06 FAIL (10/10), khớp máy Mac; chạy 43 giây so với 23 giây trên máy Mac.</w:t>
+      </w:r>
+    </w:p>
+    <w:p>
+      <w:pPr>
+        <w:pStyle w:val="ListParagraph"/>
+        <w:numPr>
+          <w:ilvl w:val="0"/>
+          <w:numId w:val="3"/>
+        </w:numPr>
+        <w:spacing w:after="60"/>
+      </w:pPr>
+      <w:r>
+        <w:t xml:space="preserve">Hai lượt chạy đầu trên máy Windows </w:t>
+      </w:r>
+      <w:r>
+        <w:rPr>
+          <w:b/>
+          <w:bCs/>
+        </w:rPr>
+        <w:t xml:space="preserve">không hợp lệ và đã bị loại</w:t>
+      </w:r>
+      <w:r>
+        <w:t xml:space="preserve">: lượt thứ nhất do máy chưa cài k6, lượt thứ hai do Cal.com dừng giữa chừng (TC-01 báo FAIL bất thường). Kết quả dùng ở trên là lượt chạy sạch sau khi khắc phục. Đây là lý do bộ test hiện có bước khởi động nóng và báo lỗi rõ khi Cal.com dừng.</w:t>
+      </w:r>
+    </w:p>
+    <w:p>
+      <w:pPr>
         <w:spacing w:after="120" w:line="300"/>
       </w:pPr>
       <w:r>
@@ -9710,7 +11213,20 @@
         <w:spacing w:after="60"/>
       </w:pPr>
       <w:r>
-        <w:t xml:space="preserve">Chưa test qua giao diện bằng Playwright; chưa chạy lại trên máy của thành viên khác.</w:t>
+        <w:t xml:space="preserve">Chưa test qua giao diện bằng Playwright.</w:t>
+      </w:r>
+    </w:p>
+    <w:p>
+      <w:pPr>
+        <w:pStyle w:val="ListParagraph"/>
+        <w:numPr>
+          <w:ilvl w:val="0"/>
+          <w:numId w:val="3"/>
+        </w:numPr>
+        <w:spacing w:after="60"/>
+      </w:pPr>
+      <w:r>
+        <w:t xml:space="preserve">Mới chạy lại trên một máy khác (Windows). Cấu hình máy đó và tên người test chưa được ghi vào báo cáo.</w:t>
       </w:r>
     </w:p>
     <w:p>
@@ -9735,7 +11251,7 @@
         <w:spacing w:after="60"/>
       </w:pPr>
       <w:r>
-        <w:t xml:space="preserve">Test qua giao diện và chạy lại trên máy sạch của thành viên khác.</w:t>
+        <w:t xml:space="preserve">Test qua giao diện bằng Playwright.</w:t>
       </w:r>
     </w:p>
     <w:p>
@@ -11702,6 +13218,63 @@
                 <w:szCs w:val="20"/>
               </w:rPr>
               <w:t xml:space="preserve">docs/KET_QUA_TEST_GIUA_KY.md</w:t>
+            </w:r>
+          </w:p>
+        </w:tc>
+      </w:tr>
+      <w:tr>
+        <w:trPr>
+          <w:tblHeader w:val="off"/>
+        </w:trPr>
+        <w:tc>
+          <w:tcPr>
+            <w:tcW w:type="dxa" w:w="4212"/>
+            <w:tcBorders>
+              <w:top w:val="single" w:color="BFBFBF" w:sz="4"/>
+              <w:left w:val="single" w:color="BFBFBF" w:sz="4"/>
+              <w:bottom w:val="single" w:color="BFBFBF" w:sz="4"/>
+              <w:right w:val="single" w:color="BFBFBF" w:sz="4"/>
+            </w:tcBorders>
+            <w:tcMar>
+              <w:top w:type="dxa" w:w="60"/>
+              <w:left w:type="dxa" w:w="100"/>
+              <w:bottom w:type="dxa" w:w="60"/>
+              <w:right w:type="dxa" w:w="100"/>
+            </w:tcMar>
+          </w:tcPr>
+          <w:p>
+            <w:r>
+              <w:rPr>
+                <w:sz w:val="20"/>
+                <w:szCs w:val="20"/>
+              </w:rPr>
+              <w:t xml:space="preserve">Kết quả chạy lại trên máy Windows</w:t>
+            </w:r>
+          </w:p>
+        </w:tc>
+        <w:tc>
+          <w:tcPr>
+            <w:tcW w:type="dxa" w:w="4814"/>
+            <w:tcBorders>
+              <w:top w:val="single" w:color="BFBFBF" w:sz="4"/>
+              <w:left w:val="single" w:color="BFBFBF" w:sz="4"/>
+              <w:bottom w:val="single" w:color="BFBFBF" w:sz="4"/>
+              <w:right w:val="single" w:color="BFBFBF" w:sz="4"/>
+            </w:tcBorders>
+            <w:tcMar>
+              <w:top w:type="dxa" w:w="60"/>
+              <w:left w:type="dxa" w:w="100"/>
+              <w:bottom w:type="dxa" w:w="60"/>
+              <w:right w:type="dxa" w:w="100"/>
+            </w:tcMar>
+          </w:tcPr>
+          <w:p>
+            <w:r>
+              <w:rPr>
+                <w:sz w:val="20"/>
+                <w:szCs w:val="20"/>
+              </w:rPr>
+              <w:t xml:space="preserve">race-tests/results/windows-race/REPORT.md, race-tests/results/windows-sequential/REPORT.md</w:t>
             </w:r>
           </w:p>
         </w:tc>

</xml_diff>

<commit_message>
docs: record the Windows tester and machine, fix run time to Vietnam time
- tester: Ngô Quốc Trường Vĩ; machine: MSI, Core i7-13620H, 16 GB RAM
- the Windows run started 02:15 on 19/10 Vietnam time (19:15 UTC on 18/10)

Co-Authored-By: Claude Sonnet 5.5 <noreply@anthropic.com>
</commit_message>
<xml_diff>
--- a/docs/BAO_CAO_GIUA_KY_R05-K15.docx
+++ b/docs/BAO_CAO_GIUA_KY_R05-K15.docx
@@ -8172,7 +8172,7 @@
         <w:spacing w:after="60"/>
       </w:pPr>
       <w:r>
-        <w:t xml:space="preserve">Người test: [điền tên thành viên]</w:t>
+        <w:t xml:space="preserve">Người test: Ngô Quốc Trường Vĩ (2312796)</w:t>
       </w:r>
     </w:p>
     <w:p>
@@ -8185,7 +8185,7 @@
         <w:spacing w:after="60"/>
       </w:pPr>
       <w:r>
-        <w:t xml:space="preserve">Cấu hình máy: [điền CPU, RAM, hệ điều hành, phiên bản Node và k6]</w:t>
+        <w:t xml:space="preserve">Cấu hình máy: MSI, Intel Core i7-13620H 2,40 GHz, RAM 16 GB (15,7 GB dùng được), Windows 64-bit; phiên bản Node và k6: [điền]</w:t>
       </w:r>
     </w:p>
     <w:p>
@@ -8198,7 +8198,7 @@
         <w:spacing w:after="60"/>
       </w:pPr>
       <w:r>
-        <w:t xml:space="preserve">Ngày chạy: 18/10/2026</w:t>
+        <w:t xml:space="preserve">Thời điểm chạy: lượt đồng thời bắt đầu lúc 19:15 UTC ngày 18/10/2026, tức 02:15 sáng ngày 19/10/2026 giờ Việt Nam</w:t>
       </w:r>
     </w:p>
     <w:p>
@@ -11226,7 +11226,7 @@
         <w:spacing w:after="60"/>
       </w:pPr>
       <w:r>
-        <w:t xml:space="preserve">Mới chạy lại trên một máy khác (Windows). Cấu hình máy đó và tên người test chưa được ghi vào báo cáo.</w:t>
+        <w:t xml:space="preserve">Mới chạy lại trên một máy khác (Windows); chưa ghi phiên bản Node và k6 của máy đó.</w:t>
       </w:r>
     </w:p>
     <w:p>

</xml_diff>

<commit_message>
docs: replace blank person-hours with a labelled workload estimate
The team did not track hours, so the cost section now gives an explicit
estimate (34-46 person-hours) per work item and says it is not measured.

Co-Authored-By: Claude Sonnet 5.5 <noreply@anthropic.com>
</commit_message>
<xml_diff>
--- a/docs/BAO_CAO_GIUA_KY_R05-K15.docx
+++ b/docs/BAO_CAO_GIUA_KY_R05-K15.docx
@@ -6389,7 +6389,7 @@
           <w:b/>
           <w:bCs/>
         </w:rPr>
-        <w:t xml:space="preserve">Công sức của nhóm (người-giờ):</w:t>
+        <w:t xml:space="preserve">Công sức của nhóm (người-giờ), ước lượng theo công việc:</w:t>
       </w:r>
     </w:p>
     <w:tbl>
@@ -6409,9 +6409,9 @@
         </w:tblCellMar>
       </w:tblPr>
       <w:tblGrid>
-        <w:gridCol w:w="4778"/>
-        <w:gridCol w:w="2123"/>
-        <w:gridCol w:w="2125"/>
+        <w:gridCol w:w="3684"/>
+        <w:gridCol w:w="1657"/>
+        <w:gridCol w:w="3685"/>
       </w:tblGrid>
       <w:tr>
         <w:trPr>
@@ -6419,7 +6419,7 @@
         </w:trPr>
         <w:tc>
           <w:tcPr>
-            <w:tcW w:type="dxa" w:w="4778"/>
+            <w:tcW w:type="dxa" w:w="3684"/>
             <w:tcBorders>
               <w:top w:val="single" w:color="BFBFBF" w:sz="4"/>
               <w:left w:val="single" w:color="BFBFBF" w:sz="4"/>
@@ -6442,13 +6442,13 @@
                 <w:sz w:val="20"/>
                 <w:szCs w:val="20"/>
               </w:rPr>
-              <w:t xml:space="preserve">Thành viên</w:t>
-            </w:r>
-          </w:p>
-        </w:tc>
-        <w:tc>
-          <w:tcPr>
-            <w:tcW w:type="dxa" w:w="2123"/>
+              <w:t xml:space="preserve">Hạng mục</w:t>
+            </w:r>
+          </w:p>
+        </w:tc>
+        <w:tc>
+          <w:tcPr>
+            <w:tcW w:type="dxa" w:w="1657"/>
             <w:tcBorders>
               <w:top w:val="single" w:color="BFBFBF" w:sz="4"/>
               <w:left w:val="single" w:color="BFBFBF" w:sz="4"/>
@@ -6471,13 +6471,13 @@
                 <w:sz w:val="20"/>
                 <w:szCs w:val="20"/>
               </w:rPr>
-              <w:t xml:space="preserve">Việc</w:t>
-            </w:r>
-          </w:p>
-        </w:tc>
-        <w:tc>
-          <w:tcPr>
-            <w:tcW w:type="dxa" w:w="2125"/>
+              <w:t xml:space="preserve">Người phụ trách</w:t>
+            </w:r>
+          </w:p>
+        </w:tc>
+        <w:tc>
+          <w:tcPr>
+            <w:tcW w:type="dxa" w:w="3685"/>
             <w:tcBorders>
               <w:top w:val="single" w:color="BFBFBF" w:sz="4"/>
               <w:left w:val="single" w:color="BFBFBF" w:sz="4"/>
@@ -6500,7 +6500,7 @@
                 <w:sz w:val="20"/>
                 <w:szCs w:val="20"/>
               </w:rPr>
-              <w:t xml:space="preserve">Số giờ</w:t>
+              <w:t xml:space="preserve">Ước lượng (giờ)</w:t>
             </w:r>
           </w:p>
         </w:tc>
@@ -6511,7 +6511,33 @@
         </w:trPr>
         <w:tc>
           <w:tcPr>
-            <w:tcW w:type="dxa" w:w="4778"/>
+            <w:tcW w:type="dxa" w:w="3684"/>
+            <w:tcBorders>
+              <w:top w:val="single" w:color="BFBFBF" w:sz="4"/>
+              <w:left w:val="single" w:color="BFBFBF" w:sz="4"/>
+              <w:bottom w:val="single" w:color="BFBFBF" w:sz="4"/>
+              <w:right w:val="single" w:color="BFBFBF" w:sz="4"/>
+            </w:tcBorders>
+            <w:tcMar>
+              <w:top w:type="dxa" w:w="60"/>
+              <w:left w:type="dxa" w:w="100"/>
+              <w:bottom w:type="dxa" w:w="60"/>
+              <w:right w:type="dxa" w:w="100"/>
+            </w:tcMar>
+          </w:tcPr>
+          <w:p>
+            <w:r>
+              <w:rPr>
+                <w:sz w:val="20"/>
+                <w:szCs w:val="20"/>
+              </w:rPr>
+              <w:t xml:space="preserve">Dựng Cal.com, seed data, chạy 3 luồng nghiệp vụ</w:t>
+            </w:r>
+          </w:p>
+        </w:tc>
+        <w:tc>
+          <w:tcPr>
+            <w:tcW w:type="dxa" w:w="1657"/>
             <w:tcBorders>
               <w:top w:val="single" w:color="BFBFBF" w:sz="4"/>
               <w:left w:val="single" w:color="BFBFBF" w:sz="4"/>
@@ -6537,39 +6563,29 @@
         </w:tc>
         <w:tc>
           <w:tcPr>
-            <w:tcW w:type="dxa" w:w="2123"/>
-            <w:tcBorders>
-              <w:top w:val="single" w:color="BFBFBF" w:sz="4"/>
-              <w:left w:val="single" w:color="BFBFBF" w:sz="4"/>
-              <w:bottom w:val="single" w:color="BFBFBF" w:sz="4"/>
-              <w:right w:val="single" w:color="BFBFBF" w:sz="4"/>
-            </w:tcBorders>
-            <w:tcMar>
-              <w:top w:type="dxa" w:w="60"/>
-              <w:left w:type="dxa" w:w="100"/>
-              <w:bottom w:type="dxa" w:w="60"/>
-              <w:right w:type="dxa" w:w="100"/>
-            </w:tcMar>
-          </w:tcPr>
-          <w:p/>
-        </w:tc>
-        <w:tc>
-          <w:tcPr>
-            <w:tcW w:type="dxa" w:w="2125"/>
-            <w:tcBorders>
-              <w:top w:val="single" w:color="BFBFBF" w:sz="4"/>
-              <w:left w:val="single" w:color="BFBFBF" w:sz="4"/>
-              <w:bottom w:val="single" w:color="BFBFBF" w:sz="4"/>
-              <w:right w:val="single" w:color="BFBFBF" w:sz="4"/>
-            </w:tcBorders>
-            <w:tcMar>
-              <w:top w:type="dxa" w:w="60"/>
-              <w:left w:type="dxa" w:w="100"/>
-              <w:bottom w:type="dxa" w:w="60"/>
-              <w:right w:type="dxa" w:w="100"/>
-            </w:tcMar>
-          </w:tcPr>
-          <w:p/>
+            <w:tcW w:type="dxa" w:w="3685"/>
+            <w:tcBorders>
+              <w:top w:val="single" w:color="BFBFBF" w:sz="4"/>
+              <w:left w:val="single" w:color="BFBFBF" w:sz="4"/>
+              <w:bottom w:val="single" w:color="BFBFBF" w:sz="4"/>
+              <w:right w:val="single" w:color="BFBFBF" w:sz="4"/>
+            </w:tcBorders>
+            <w:tcMar>
+              <w:top w:type="dxa" w:w="60"/>
+              <w:left w:type="dxa" w:w="100"/>
+              <w:bottom w:type="dxa" w:w="60"/>
+              <w:right w:type="dxa" w:w="100"/>
+            </w:tcMar>
+          </w:tcPr>
+          <w:p>
+            <w:r>
+              <w:rPr>
+                <w:sz w:val="20"/>
+                <w:szCs w:val="20"/>
+              </w:rPr>
+              <w:t xml:space="preserve">6 đến 8</w:t>
+            </w:r>
+          </w:p>
         </w:tc>
       </w:tr>
       <w:tr>
@@ -6578,7 +6594,33 @@
         </w:trPr>
         <w:tc>
           <w:tcPr>
-            <w:tcW w:type="dxa" w:w="4778"/>
+            <w:tcW w:type="dxa" w:w="3684"/>
+            <w:tcBorders>
+              <w:top w:val="single" w:color="BFBFBF" w:sz="4"/>
+              <w:left w:val="single" w:color="BFBFBF" w:sz="4"/>
+              <w:bottom w:val="single" w:color="BFBFBF" w:sz="4"/>
+              <w:right w:val="single" w:color="BFBFBF" w:sz="4"/>
+            </w:tcBorders>
+            <w:tcMar>
+              <w:top w:type="dxa" w:w="60"/>
+              <w:left w:type="dxa" w:w="100"/>
+              <w:bottom w:type="dxa" w:w="60"/>
+              <w:right w:type="dxa" w:w="100"/>
+            </w:tcMar>
+          </w:tcPr>
+          <w:p>
+            <w:r>
+              <w:rPr>
+                <w:sz w:val="20"/>
+                <w:szCs w:val="20"/>
+              </w:rPr>
+              <w:t xml:space="preserve">Đọc code, vẽ kiến trúc, phân tích nguyên nhân gốc</w:t>
+            </w:r>
+          </w:p>
+        </w:tc>
+        <w:tc>
+          <w:tcPr>
+            <w:tcW w:type="dxa" w:w="1657"/>
             <w:tcBorders>
               <w:top w:val="single" w:color="BFBFBF" w:sz="4"/>
               <w:left w:val="single" w:color="BFBFBF" w:sz="4"/>
@@ -6604,39 +6646,29 @@
         </w:tc>
         <w:tc>
           <w:tcPr>
-            <w:tcW w:type="dxa" w:w="2123"/>
-            <w:tcBorders>
-              <w:top w:val="single" w:color="BFBFBF" w:sz="4"/>
-              <w:left w:val="single" w:color="BFBFBF" w:sz="4"/>
-              <w:bottom w:val="single" w:color="BFBFBF" w:sz="4"/>
-              <w:right w:val="single" w:color="BFBFBF" w:sz="4"/>
-            </w:tcBorders>
-            <w:tcMar>
-              <w:top w:type="dxa" w:w="60"/>
-              <w:left w:type="dxa" w:w="100"/>
-              <w:bottom w:type="dxa" w:w="60"/>
-              <w:right w:type="dxa" w:w="100"/>
-            </w:tcMar>
-          </w:tcPr>
-          <w:p/>
-        </w:tc>
-        <w:tc>
-          <w:tcPr>
-            <w:tcW w:type="dxa" w:w="2125"/>
-            <w:tcBorders>
-              <w:top w:val="single" w:color="BFBFBF" w:sz="4"/>
-              <w:left w:val="single" w:color="BFBFBF" w:sz="4"/>
-              <w:bottom w:val="single" w:color="BFBFBF" w:sz="4"/>
-              <w:right w:val="single" w:color="BFBFBF" w:sz="4"/>
-            </w:tcBorders>
-            <w:tcMar>
-              <w:top w:type="dxa" w:w="60"/>
-              <w:left w:type="dxa" w:w="100"/>
-              <w:bottom w:type="dxa" w:w="60"/>
-              <w:right w:type="dxa" w:w="100"/>
-            </w:tcMar>
-          </w:tcPr>
-          <w:p/>
+            <w:tcW w:type="dxa" w:w="3685"/>
+            <w:tcBorders>
+              <w:top w:val="single" w:color="BFBFBF" w:sz="4"/>
+              <w:left w:val="single" w:color="BFBFBF" w:sz="4"/>
+              <w:bottom w:val="single" w:color="BFBFBF" w:sz="4"/>
+              <w:right w:val="single" w:color="BFBFBF" w:sz="4"/>
+            </w:tcBorders>
+            <w:tcMar>
+              <w:top w:type="dxa" w:w="60"/>
+              <w:left w:type="dxa" w:w="100"/>
+              <w:bottom w:type="dxa" w:w="60"/>
+              <w:right w:type="dxa" w:w="100"/>
+            </w:tcMar>
+          </w:tcPr>
+          <w:p>
+            <w:r>
+              <w:rPr>
+                <w:sz w:val="20"/>
+                <w:szCs w:val="20"/>
+              </w:rPr>
+              <w:t xml:space="preserve">6 đến 8</w:t>
+            </w:r>
+          </w:p>
         </w:tc>
       </w:tr>
       <w:tr>
@@ -6645,7 +6677,33 @@
         </w:trPr>
         <w:tc>
           <w:tcPr>
-            <w:tcW w:type="dxa" w:w="4778"/>
+            <w:tcW w:type="dxa" w:w="3684"/>
+            <w:tcBorders>
+              <w:top w:val="single" w:color="BFBFBF" w:sz="4"/>
+              <w:left w:val="single" w:color="BFBFBF" w:sz="4"/>
+              <w:bottom w:val="single" w:color="BFBFBF" w:sz="4"/>
+              <w:right w:val="single" w:color="BFBFBF" w:sz="4"/>
+            </w:tcBorders>
+            <w:tcMar>
+              <w:top w:type="dxa" w:w="60"/>
+              <w:left w:type="dxa" w:w="100"/>
+              <w:bottom w:type="dxa" w:w="60"/>
+              <w:right w:type="dxa" w:w="100"/>
+            </w:tcMar>
+          </w:tcPr>
+          <w:p>
+            <w:r>
+              <w:rPr>
+                <w:sz w:val="20"/>
+                <w:szCs w:val="20"/>
+              </w:rPr>
+              <w:t xml:space="preserve">Thiết kế test case, viết bộ test</w:t>
+            </w:r>
+          </w:p>
+        </w:tc>
+        <w:tc>
+          <w:tcPr>
+            <w:tcW w:type="dxa" w:w="1657"/>
             <w:tcBorders>
               <w:top w:val="single" w:color="BFBFBF" w:sz="4"/>
               <w:left w:val="single" w:color="BFBFBF" w:sz="4"/>
@@ -6671,39 +6729,29 @@
         </w:tc>
         <w:tc>
           <w:tcPr>
-            <w:tcW w:type="dxa" w:w="2123"/>
-            <w:tcBorders>
-              <w:top w:val="single" w:color="BFBFBF" w:sz="4"/>
-              <w:left w:val="single" w:color="BFBFBF" w:sz="4"/>
-              <w:bottom w:val="single" w:color="BFBFBF" w:sz="4"/>
-              <w:right w:val="single" w:color="BFBFBF" w:sz="4"/>
-            </w:tcBorders>
-            <w:tcMar>
-              <w:top w:type="dxa" w:w="60"/>
-              <w:left w:type="dxa" w:w="100"/>
-              <w:bottom w:type="dxa" w:w="60"/>
-              <w:right w:type="dxa" w:w="100"/>
-            </w:tcMar>
-          </w:tcPr>
-          <w:p/>
-        </w:tc>
-        <w:tc>
-          <w:tcPr>
-            <w:tcW w:type="dxa" w:w="2125"/>
-            <w:tcBorders>
-              <w:top w:val="single" w:color="BFBFBF" w:sz="4"/>
-              <w:left w:val="single" w:color="BFBFBF" w:sz="4"/>
-              <w:bottom w:val="single" w:color="BFBFBF" w:sz="4"/>
-              <w:right w:val="single" w:color="BFBFBF" w:sz="4"/>
-            </w:tcBorders>
-            <w:tcMar>
-              <w:top w:type="dxa" w:w="60"/>
-              <w:left w:type="dxa" w:w="100"/>
-              <w:bottom w:type="dxa" w:w="60"/>
-              <w:right w:type="dxa" w:w="100"/>
-            </w:tcMar>
-          </w:tcPr>
-          <w:p/>
+            <w:tcW w:type="dxa" w:w="3685"/>
+            <w:tcBorders>
+              <w:top w:val="single" w:color="BFBFBF" w:sz="4"/>
+              <w:left w:val="single" w:color="BFBFBF" w:sz="4"/>
+              <w:bottom w:val="single" w:color="BFBFBF" w:sz="4"/>
+              <w:right w:val="single" w:color="BFBFBF" w:sz="4"/>
+            </w:tcBorders>
+            <w:tcMar>
+              <w:top w:type="dxa" w:w="60"/>
+              <w:left w:type="dxa" w:w="100"/>
+              <w:bottom w:type="dxa" w:w="60"/>
+              <w:right w:type="dxa" w:w="100"/>
+            </w:tcMar>
+          </w:tcPr>
+          <w:p>
+            <w:r>
+              <w:rPr>
+                <w:sz w:val="20"/>
+                <w:szCs w:val="20"/>
+              </w:rPr>
+              <w:t xml:space="preserve">10 đến 14</w:t>
+            </w:r>
+          </w:p>
         </w:tc>
       </w:tr>
       <w:tr>
@@ -6712,7 +6760,33 @@
         </w:trPr>
         <w:tc>
           <w:tcPr>
-            <w:tcW w:type="dxa" w:w="4778"/>
+            <w:tcW w:type="dxa" w:w="3684"/>
+            <w:tcBorders>
+              <w:top w:val="single" w:color="BFBFBF" w:sz="4"/>
+              <w:left w:val="single" w:color="BFBFBF" w:sz="4"/>
+              <w:bottom w:val="single" w:color="BFBFBF" w:sz="4"/>
+              <w:right w:val="single" w:color="BFBFBF" w:sz="4"/>
+            </w:tcBorders>
+            <w:tcMar>
+              <w:top w:type="dxa" w:w="60"/>
+              <w:left w:type="dxa" w:w="100"/>
+              <w:bottom w:type="dxa" w:w="60"/>
+              <w:right w:type="dxa" w:w="100"/>
+            </w:tcMar>
+          </w:tcPr>
+          <w:p>
+            <w:r>
+              <w:rPr>
+                <w:sz w:val="20"/>
+                <w:szCs w:val="20"/>
+              </w:rPr>
+              <w:t xml:space="preserve">Chạy test, ghi kết quả, báo cáo, slide</w:t>
+            </w:r>
+          </w:p>
+        </w:tc>
+        <w:tc>
+          <w:tcPr>
+            <w:tcW w:type="dxa" w:w="1657"/>
             <w:tcBorders>
               <w:top w:val="single" w:color="BFBFBF" w:sz="4"/>
               <w:left w:val="single" w:color="BFBFBF" w:sz="4"/>
@@ -6738,7 +6812,64 @@
         </w:tc>
         <w:tc>
           <w:tcPr>
-            <w:tcW w:type="dxa" w:w="2123"/>
+            <w:tcW w:type="dxa" w:w="3685"/>
+            <w:tcBorders>
+              <w:top w:val="single" w:color="BFBFBF" w:sz="4"/>
+              <w:left w:val="single" w:color="BFBFBF" w:sz="4"/>
+              <w:bottom w:val="single" w:color="BFBFBF" w:sz="4"/>
+              <w:right w:val="single" w:color="BFBFBF" w:sz="4"/>
+            </w:tcBorders>
+            <w:tcMar>
+              <w:top w:type="dxa" w:w="60"/>
+              <w:left w:type="dxa" w:w="100"/>
+              <w:bottom w:type="dxa" w:w="60"/>
+              <w:right w:type="dxa" w:w="100"/>
+            </w:tcMar>
+          </w:tcPr>
+          <w:p>
+            <w:r>
+              <w:rPr>
+                <w:sz w:val="20"/>
+                <w:szCs w:val="20"/>
+              </w:rPr>
+              <w:t xml:space="preserve">12 đến 16</w:t>
+            </w:r>
+          </w:p>
+        </w:tc>
+      </w:tr>
+      <w:tr>
+        <w:trPr>
+          <w:tblHeader w:val="off"/>
+        </w:trPr>
+        <w:tc>
+          <w:tcPr>
+            <w:tcW w:type="dxa" w:w="3684"/>
+            <w:tcBorders>
+              <w:top w:val="single" w:color="BFBFBF" w:sz="4"/>
+              <w:left w:val="single" w:color="BFBFBF" w:sz="4"/>
+              <w:bottom w:val="single" w:color="BFBFBF" w:sz="4"/>
+              <w:right w:val="single" w:color="BFBFBF" w:sz="4"/>
+            </w:tcBorders>
+            <w:tcMar>
+              <w:top w:type="dxa" w:w="60"/>
+              <w:left w:type="dxa" w:w="100"/>
+              <w:bottom w:type="dxa" w:w="60"/>
+              <w:right w:type="dxa" w:w="100"/>
+            </w:tcMar>
+          </w:tcPr>
+          <w:p>
+            <w:r>
+              <w:rPr>
+                <w:sz w:val="20"/>
+                <w:szCs w:val="20"/>
+              </w:rPr>
+              <w:t xml:space="preserve">Tổng</w:t>
+            </w:r>
+          </w:p>
+        </w:tc>
+        <w:tc>
+          <w:tcPr>
+            <w:tcW w:type="dxa" w:w="1657"/>
             <w:tcBorders>
               <w:top w:val="single" w:color="BFBFBF" w:sz="4"/>
               <w:left w:val="single" w:color="BFBFBF" w:sz="4"/>
@@ -6756,21 +6887,29 @@
         </w:tc>
         <w:tc>
           <w:tcPr>
-            <w:tcW w:type="dxa" w:w="2125"/>
-            <w:tcBorders>
-              <w:top w:val="single" w:color="BFBFBF" w:sz="4"/>
-              <w:left w:val="single" w:color="BFBFBF" w:sz="4"/>
-              <w:bottom w:val="single" w:color="BFBFBF" w:sz="4"/>
-              <w:right w:val="single" w:color="BFBFBF" w:sz="4"/>
-            </w:tcBorders>
-            <w:tcMar>
-              <w:top w:type="dxa" w:w="60"/>
-              <w:left w:type="dxa" w:w="100"/>
-              <w:bottom w:type="dxa" w:w="60"/>
-              <w:right w:type="dxa" w:w="100"/>
-            </w:tcMar>
-          </w:tcPr>
-          <w:p/>
+            <w:tcW w:type="dxa" w:w="3685"/>
+            <w:tcBorders>
+              <w:top w:val="single" w:color="BFBFBF" w:sz="4"/>
+              <w:left w:val="single" w:color="BFBFBF" w:sz="4"/>
+              <w:bottom w:val="single" w:color="BFBFBF" w:sz="4"/>
+              <w:right w:val="single" w:color="BFBFBF" w:sz="4"/>
+            </w:tcBorders>
+            <w:tcMar>
+              <w:top w:type="dxa" w:w="60"/>
+              <w:left w:type="dxa" w:w="100"/>
+              <w:bottom w:type="dxa" w:w="60"/>
+              <w:right w:type="dxa" w:w="100"/>
+            </w:tcMar>
+          </w:tcPr>
+          <w:p>
+            <w:r>
+              <w:rPr>
+                <w:sz w:val="20"/>
+                <w:szCs w:val="20"/>
+              </w:rPr>
+              <w:t xml:space="preserve">34 đến 46 giờ, khoảng 9 đến 12 giờ mỗi người</w:t>
+            </w:r>
+          </w:p>
         </w:tc>
       </w:tr>
     </w:tbl>
@@ -6778,6 +6917,34 @@
       <w:pPr>
         <w:spacing w:after="160"/>
       </w:pPr>
+    </w:p>
+    <w:p>
+      <w:pPr>
+        <w:spacing w:after="120" w:line="300"/>
+      </w:pPr>
+      <w:r>
+        <w:t xml:space="preserve">Đây là </w:t>
+      </w:r>
+      <w:r>
+        <w:rPr>
+          <w:b/>
+          <w:bCs/>
+        </w:rPr>
+        <w:t xml:space="preserve">ước lượng</w:t>
+      </w:r>
+      <w:r>
+        <w:t xml:space="preserve"> của nhóm cho khối lượng công việc, </w:t>
+      </w:r>
+      <w:r>
+        <w:rPr>
+          <w:b/>
+          <w:bCs/>
+        </w:rPr>
+        <w:t xml:space="preserve">không phải số giờ ghi lại thực tế</w:t>
+      </w:r>
+      <w:r>
+        <w:t xml:space="preserve">. Nhóm chưa theo dõi giờ làm từng người.</w:t>
+      </w:r>
     </w:p>
     <w:p>
       <w:pPr>

</xml_diff>